<commit_message>
docs: update weekly work assignment reports and remove temporary lock file
</commit_message>
<xml_diff>
--- a/phan_cong_cong_viec.docx
+++ b/phan_cong_cong_viec.docx
@@ -297,14 +297,83 @@
           <w:b/>
           <w:sz w:val="21"/>
         </w:rPr>
-        <w:t>Vy Tran:</w:t>
+        <w:t>Trung Pham (Team Leader &amp; Backend Developer):</w:t>
       </w:r>
       <w:r>
         <w:rPr>
           <w:rFonts w:ascii="Calibri" w:hAnsi="Calibri"/>
           <w:sz w:val="21"/>
         </w:rPr>
-        <w:t xml:space="preserve"> Phụ trách toàn diện phần Frontend (UI/UX), đảm bảo xây dựng hệ thống giao diện trực quan, đồng bộ và kết nối API liền mạch cho tất cả các luồng vận hành từ máy tính quản lý đến thiết bị thao tác tại kho.</w:t>
+        <w:t xml:space="preserve"> Là Nhóm trưởng dự án kiêm Backend Developer.</w:t>
+      </w:r>
+    </w:p>
+    <w:p>
+      <w:pPr>
+        <w:spacing w:before="60" w:after="80" w:line="276" w:lineRule="auto"/>
+      </w:pPr>
+      <w:r>
+        <w:rPr>
+          <w:rFonts w:ascii="Calibri" w:hAnsi="Calibri"/>
+          <w:sz w:val="21"/>
+        </w:rPr>
+        <w:t xml:space="preserve">+ </w:t>
+      </w:r>
+      <w:r>
+        <w:rPr>
+          <w:rFonts w:ascii="Calibri" w:hAnsi="Calibri"/>
+          <w:b/>
+          <w:sz w:val="21"/>
+        </w:rPr>
+        <w:t>Nhiệm vụ Quản trị &amp; Điều phối (Leader):</w:t>
+      </w:r>
+      <w:r>
+        <w:rPr>
+          <w:rFonts w:ascii="Calibri" w:hAnsi="Calibri"/>
+          <w:sz w:val="21"/>
+        </w:rPr>
+        <w:t xml:space="preserve"> Chủ trì lấy ý kiến cả nhóm về thiết kế và xây dựng web; lập kế hoạch tổng thể (Plan) và phân công công việc chi tiết cho từng thành viên theo từng tuần/sprint; rà soát, đối soát kết quả công việc (review code, API, CSDL) của các thành viên; và trực tiếp thực hiện kiểm thử thủ công (Manual Testing) toàn bộ các luồng tính năng trước mỗi buổi Demo.</w:t>
+      </w:r>
+    </w:p>
+    <w:p>
+      <w:pPr>
+        <w:spacing w:before="60" w:after="80" w:line="276" w:lineRule="auto"/>
+      </w:pPr>
+      <w:r>
+        <w:rPr>
+          <w:rFonts w:ascii="Calibri" w:hAnsi="Calibri"/>
+          <w:sz w:val="21"/>
+        </w:rPr>
+        <w:t xml:space="preserve">+ </w:t>
+      </w:r>
+      <w:r>
+        <w:rPr>
+          <w:rFonts w:ascii="Calibri" w:hAnsi="Calibri"/>
+          <w:b/>
+          <w:sz w:val="21"/>
+        </w:rPr>
+        <w:t>Nhiệm vụ Kỹ thuật (Backend):</w:t>
+      </w:r>
+      <w:r>
+        <w:rPr>
+          <w:rFonts w:ascii="Calibri" w:hAnsi="Calibri"/>
+          <w:sz w:val="21"/>
+        </w:rPr>
+        <w:t xml:space="preserve"> Phụ trách Danh mục Master Data (Kho, Vị trí, Đơn vị tính, Sản phẩm), Quản lý Nhà cung cấp, Cơ chế Bút toán đảo an toàn (</w:t>
+      </w:r>
+      <w:r>
+        <w:rPr>
+          <w:rFonts w:ascii="Consolas" w:hAnsi="Consolas"/>
+          <w:color w:val="9C4124"/>
+          <w:sz w:val="20"/>
+        </w:rPr>
+        <w:t>Reversal</w:t>
+      </w:r>
+      <w:r>
+        <w:rPr>
+          <w:rFonts w:ascii="Calibri" w:hAnsi="Calibri"/>
+          <w:sz w:val="21"/>
+        </w:rPr>
+        <w:t>), Bảo mật/RBAC Patch, Cảnh báo hạn sử dụng và Hệ thống API Dashboard tổng quan phân nhánh theo 5 Role.</w:t>
       </w:r>
     </w:p>
     <w:p>
@@ -471,29 +540,14 @@
           <w:b/>
           <w:sz w:val="21"/>
         </w:rPr>
-        <w:t>Trung Pham:</w:t>
+        <w:t>Vy Tran:</w:t>
       </w:r>
       <w:r>
         <w:rPr>
           <w:rFonts w:ascii="Calibri" w:hAnsi="Calibri"/>
           <w:sz w:val="21"/>
         </w:rPr>
-        <w:t xml:space="preserve"> Phụ trách Danh mục Master Data (Kho, Vị trí, Đơn vị tính, Sản phẩm), Quản lý Nhà cung cấp, Cơ chế Bút toán đảo an toàn (</w:t>
-      </w:r>
-      <w:r>
-        <w:rPr>
-          <w:rFonts w:ascii="Consolas" w:hAnsi="Consolas"/>
-          <w:color w:val="9C4124"/>
-          <w:sz w:val="20"/>
-        </w:rPr>
-        <w:t>Reversal</w:t>
-      </w:r>
-      <w:r>
-        <w:rPr>
-          <w:rFonts w:ascii="Calibri" w:hAnsi="Calibri"/>
-          <w:sz w:val="21"/>
-        </w:rPr>
-        <w:t>), Bảo mật/RBAC Patch, và Hệ thống API Dashboard tổng quan phân nhánh theo 5 Role.</w:t>
+        <w:t xml:space="preserve"> Phụ trách toàn diện phần Frontend (UI/UX), đảm bảo xây dựng hệ thống giao diện trực quan, đồng bộ và kết nối API liền mạch cho tất cả các luồng vận hành từ máy tính quản lý đến thiết bị thao tác tại kho.</w:t>
       </w:r>
     </w:p>
     <w:p>
@@ -988,7 +1042,7 @@
                 <w:b/>
                 <w:sz w:val="19"/>
               </w:rPr>
-              <w:t>Nam Nguyen</w:t>
+              <w:t>Trung Pham</w:t>
             </w:r>
           </w:p>
         </w:tc>
@@ -1013,7 +1067,7 @@
                 <w:b/>
                 <w:sz w:val="19"/>
               </w:rPr>
-              <w:t>Domain A — Authentication &amp; RBAC</w:t>
+              <w:t>Team Leader</w:t>
             </w:r>
           </w:p>
           <w:p>
@@ -1038,7 +1092,7 @@
                 <w:b/>
                 <w:sz w:val="19"/>
               </w:rPr>
-              <w:t>Domain E — Stock Ledger &amp; Movement</w:t>
+              <w:t>Domain C — Product &amp; Supplier</w:t>
             </w:r>
           </w:p>
         </w:tc>
@@ -1063,22 +1117,22 @@
                 <w:rFonts w:ascii="Calibri" w:hAnsi="Calibri"/>
                 <w:sz w:val="19"/>
               </w:rPr>
-              <w:t>• Phân tích cấu trúc bảng Quản lý User, Role, Permission và cơ chế phân quyền theo phạm vi Kho hàng (</w:t>
-            </w:r>
-            <w:r>
-              <w:rPr>
-                <w:rFonts w:ascii="Consolas" w:hAnsi="Consolas"/>
-                <w:color w:val="9C4124"/>
-                <w:sz w:val="18"/>
-              </w:rPr>
-              <w:t>warehouse_id</w:t>
-            </w:r>
-            <w:r>
-              <w:rPr>
-                <w:rFonts w:ascii="Calibri" w:hAnsi="Calibri"/>
-                <w:sz w:val="19"/>
-              </w:rPr>
-              <w:t>).</w:t>
+              <w:t xml:space="preserve">• </w:t>
+            </w:r>
+            <w:r>
+              <w:rPr>
+                <w:rFonts w:ascii="Calibri" w:hAnsi="Calibri"/>
+                <w:b/>
+                <w:sz w:val="19"/>
+              </w:rPr>
+              <w:t>Nhiệm vụ Leader:</w:t>
+            </w:r>
+            <w:r>
+              <w:rPr>
+                <w:rFonts w:ascii="Calibri" w:hAnsi="Calibri"/>
+                <w:sz w:val="19"/>
+              </w:rPr>
+              <w:t xml:space="preserve"> Chủ trì các buổi họp khảo sát, lấy ý kiến cả nhóm về luồng nghiệp vụ và định hướng kiến trúc web; lập tài liệu kế hoạch tổng thể (Sprint 0 Plan), phân chia 5 Domain cho từng thành viên; rà soát, đối soát và hợp nhất tài liệu ERD, Data Dictionary, Business Rules chung.</w:t>
             </w:r>
           </w:p>
           <w:p>
@@ -1091,7 +1145,22 @@
                 <w:rFonts w:ascii="Calibri" w:hAnsi="Calibri"/>
                 <w:sz w:val="19"/>
               </w:rPr>
-              <w:t>• Thiết kế tài liệu phân loại các loại giao dịch kho (</w:t>
+              <w:t xml:space="preserve">• </w:t>
+            </w:r>
+            <w:r>
+              <w:rPr>
+                <w:rFonts w:ascii="Calibri" w:hAnsi="Calibri"/>
+                <w:b/>
+                <w:sz w:val="19"/>
+              </w:rPr>
+              <w:t>Nhiệm vụ Domain C:</w:t>
+            </w:r>
+            <w:r>
+              <w:rPr>
+                <w:rFonts w:ascii="Calibri" w:hAnsi="Calibri"/>
+                <w:sz w:val="19"/>
+              </w:rPr>
+              <w:t xml:space="preserve"> Phân tích quản lý danh mục Hàng hóa (SKU), Đơn vị tính cơ bản (</w:t>
             </w:r>
             <w:r>
               <w:rPr>
@@ -1099,14 +1168,29 @@
                 <w:color w:val="9C4124"/>
                 <w:sz w:val="18"/>
               </w:rPr>
-              <w:t>movement_type_code</w:t>
-            </w:r>
-            <w:r>
-              <w:rPr>
-                <w:rFonts w:ascii="Calibri" w:hAnsi="Calibri"/>
-                <w:sz w:val="19"/>
-              </w:rPr>
-              <w:t>: RECEIPT, SHIPMENT, TRANSFER, ADJUST...).</w:t>
+              <w:t>base_uom</w:t>
+            </w:r>
+            <w:r>
+              <w:rPr>
+                <w:rFonts w:ascii="Calibri" w:hAnsi="Calibri"/>
+                <w:sz w:val="19"/>
+              </w:rPr>
+              <w:t>), Bảng tỷ lệ quy đổi đơn vị (</w:t>
+            </w:r>
+            <w:r>
+              <w:rPr>
+                <w:rFonts w:ascii="Consolas" w:hAnsi="Consolas"/>
+                <w:color w:val="9C4124"/>
+                <w:sz w:val="18"/>
+              </w:rPr>
+              <w:t>sku_uom_conversions</w:t>
+            </w:r>
+            <w:r>
+              <w:rPr>
+                <w:rFonts w:ascii="Calibri" w:hAnsi="Calibri"/>
+                <w:sz w:val="19"/>
+              </w:rPr>
+              <w:t>).</w:t>
             </w:r>
           </w:p>
           <w:p>
@@ -1119,7 +1203,7 @@
                 <w:rFonts w:ascii="Calibri" w:hAnsi="Calibri"/>
                 <w:sz w:val="19"/>
               </w:rPr>
-              <w:t xml:space="preserve">• Xây dựng nguyên tắc sổ cái </w:t>
+              <w:t>• Phân tích cấu trúc quản lý Nhà cung cấp (Suppliers), liên kết sản phẩm phân phối (</w:t>
             </w:r>
             <w:r>
               <w:rPr>
@@ -1127,14 +1211,72 @@
                 <w:color w:val="9C4124"/>
                 <w:sz w:val="18"/>
               </w:rPr>
-              <w:t>stock_ledger</w:t>
-            </w:r>
-            <w:r>
-              <w:rPr>
-                <w:rFonts w:ascii="Calibri" w:hAnsi="Calibri"/>
-                <w:sz w:val="19"/>
-              </w:rPr>
-              <w:t xml:space="preserve"> bất biến (Append-only).</w:t>
+              <w:t>sku_suppliers</w:t>
+            </w:r>
+            <w:r>
+              <w:rPr>
+                <w:rFonts w:ascii="Calibri" w:hAnsi="Calibri"/>
+                <w:sz w:val="19"/>
+              </w:rPr>
+              <w:t>) và mã vạch (</w:t>
+            </w:r>
+            <w:r>
+              <w:rPr>
+                <w:rFonts w:ascii="Consolas" w:hAnsi="Consolas"/>
+                <w:color w:val="9C4124"/>
+                <w:sz w:val="18"/>
+              </w:rPr>
+              <w:t>sku_barcodes</w:t>
+            </w:r>
+            <w:r>
+              <w:rPr>
+                <w:rFonts w:ascii="Calibri" w:hAnsi="Calibri"/>
+                <w:sz w:val="19"/>
+              </w:rPr>
+              <w:t>).</w:t>
+            </w:r>
+          </w:p>
+          <w:p>
+            <w:pPr>
+              <w:spacing w:before="20" w:after="40" w:line="276" w:lineRule="auto"/>
+              <w:ind w:left="216"/>
+            </w:pPr>
+            <w:r>
+              <w:rPr>
+                <w:rFonts w:ascii="Calibri" w:hAnsi="Calibri"/>
+                <w:sz w:val="19"/>
+              </w:rPr>
+              <w:t xml:space="preserve">• Đưa ra các thuộc tính kiểm soát: </w:t>
+            </w:r>
+            <w:r>
+              <w:rPr>
+                <w:rFonts w:ascii="Consolas" w:hAnsi="Consolas"/>
+                <w:color w:val="9C4124"/>
+                <w:sz w:val="18"/>
+              </w:rPr>
+              <w:t>is_lot_tracked</w:t>
+            </w:r>
+            <w:r>
+              <w:rPr>
+                <w:rFonts w:ascii="Calibri" w:hAnsi="Calibri"/>
+                <w:sz w:val="19"/>
+              </w:rPr>
+              <w:t xml:space="preserve">, </w:t>
+            </w:r>
+            <w:r>
+              <w:rPr>
+                <w:rFonts w:ascii="Consolas" w:hAnsi="Consolas"/>
+                <w:color w:val="9C4124"/>
+                <w:sz w:val="18"/>
+              </w:rPr>
+              <w:t>is_serial_tracked</w:t>
+            </w:r>
+            <w:r>
+              <w:rPr>
+                <w:rFonts w:ascii="Calibri" w:hAnsi="Calibri"/>
+                <w:sz w:val="19"/>
+              </w:rPr>
+              <w:t>, trọng lượng, thể tích sản phẩm.</w:t>
             </w:r>
           </w:p>
         </w:tc>
@@ -1159,7 +1301,7 @@
                 <w:rFonts w:ascii="Calibri" w:hAnsi="Calibri"/>
                 <w:sz w:val="19"/>
               </w:rPr>
-              <w:t>• Tài liệu &amp; ERD Domain A (</w:t>
+              <w:t>• Bản kế hoạch phân công công việc &amp; Quy ước làm việc nhóm (</w:t>
             </w:r>
             <w:r>
               <w:rPr>
@@ -1167,52 +1309,7 @@
                 <w:color w:val="9C4124"/>
                 <w:sz w:val="18"/>
               </w:rPr>
-              <w:t>users</w:t>
-            </w:r>
-            <w:r>
-              <w:rPr>
-                <w:rFonts w:ascii="Calibri" w:hAnsi="Calibri"/>
-                <w:sz w:val="19"/>
-              </w:rPr>
-              <w:t xml:space="preserve">, </w:t>
-            </w:r>
-            <w:r>
-              <w:rPr>
-                <w:rFonts w:ascii="Consolas" w:hAnsi="Consolas"/>
-                <w:color w:val="9C4124"/>
-                <w:sz w:val="18"/>
-              </w:rPr>
-              <w:t>roles</w:t>
-            </w:r>
-            <w:r>
-              <w:rPr>
-                <w:rFonts w:ascii="Calibri" w:hAnsi="Calibri"/>
-                <w:sz w:val="19"/>
-              </w:rPr>
-              <w:t xml:space="preserve">, </w:t>
-            </w:r>
-            <w:r>
-              <w:rPr>
-                <w:rFonts w:ascii="Consolas" w:hAnsi="Consolas"/>
-                <w:color w:val="9C4124"/>
-                <w:sz w:val="18"/>
-              </w:rPr>
-              <w:t>permissions</w:t>
-            </w:r>
-            <w:r>
-              <w:rPr>
-                <w:rFonts w:ascii="Calibri" w:hAnsi="Calibri"/>
-                <w:sz w:val="19"/>
-              </w:rPr>
-              <w:t xml:space="preserve">, </w:t>
-            </w:r>
-            <w:r>
-              <w:rPr>
-                <w:rFonts w:ascii="Consolas" w:hAnsi="Consolas"/>
-                <w:color w:val="9C4124"/>
-                <w:sz w:val="18"/>
-              </w:rPr>
-              <w:t>user_roles</w:t>
+              <w:t>Quy ước.docx</w:t>
             </w:r>
             <w:r>
               <w:rPr>
@@ -1232,7 +1329,7 @@
                 <w:rFonts w:ascii="Calibri" w:hAnsi="Calibri"/>
                 <w:sz w:val="19"/>
               </w:rPr>
-              <w:t>• Tài liệu &amp; ERD Domain E (</w:t>
+              <w:t>• Tài liệu &amp; ERD Domain C (</w:t>
             </w:r>
             <w:r>
               <w:rPr>
@@ -1240,7 +1337,7 @@
                 <w:color w:val="9C4124"/>
                 <w:sz w:val="18"/>
               </w:rPr>
-              <w:t>stock_ledger</w:t>
+              <w:t>skus</w:t>
             </w:r>
             <w:r>
               <w:rPr>
@@ -1255,7 +1352,67 @@
                 <w:color w:val="9C4124"/>
                 <w:sz w:val="18"/>
               </w:rPr>
-              <w:t>movement_types</w:t>
+              <w:t>uoms</w:t>
+            </w:r>
+            <w:r>
+              <w:rPr>
+                <w:rFonts w:ascii="Calibri" w:hAnsi="Calibri"/>
+                <w:sz w:val="19"/>
+              </w:rPr>
+              <w:t xml:space="preserve">, </w:t>
+            </w:r>
+            <w:r>
+              <w:rPr>
+                <w:rFonts w:ascii="Consolas" w:hAnsi="Consolas"/>
+                <w:color w:val="9C4124"/>
+                <w:sz w:val="18"/>
+              </w:rPr>
+              <w:t>sku_uom_conversions</w:t>
+            </w:r>
+            <w:r>
+              <w:rPr>
+                <w:rFonts w:ascii="Calibri" w:hAnsi="Calibri"/>
+                <w:sz w:val="19"/>
+              </w:rPr>
+              <w:t xml:space="preserve">, </w:t>
+            </w:r>
+            <w:r>
+              <w:rPr>
+                <w:rFonts w:ascii="Consolas" w:hAnsi="Consolas"/>
+                <w:color w:val="9C4124"/>
+                <w:sz w:val="18"/>
+              </w:rPr>
+              <w:t>suppliers</w:t>
+            </w:r>
+            <w:r>
+              <w:rPr>
+                <w:rFonts w:ascii="Calibri" w:hAnsi="Calibri"/>
+                <w:sz w:val="19"/>
+              </w:rPr>
+              <w:t xml:space="preserve">, </w:t>
+            </w:r>
+            <w:r>
+              <w:rPr>
+                <w:rFonts w:ascii="Consolas" w:hAnsi="Consolas"/>
+                <w:color w:val="9C4124"/>
+                <w:sz w:val="18"/>
+              </w:rPr>
+              <w:t>sku_suppliers</w:t>
+            </w:r>
+            <w:r>
+              <w:rPr>
+                <w:rFonts w:ascii="Calibri" w:hAnsi="Calibri"/>
+                <w:sz w:val="19"/>
+              </w:rPr>
+              <w:t xml:space="preserve">, </w:t>
+            </w:r>
+            <w:r>
+              <w:rPr>
+                <w:rFonts w:ascii="Consolas" w:hAnsi="Consolas"/>
+                <w:color w:val="9C4124"/>
+                <w:sz w:val="18"/>
+              </w:rPr>
+              <w:t>sku_barcodes</w:t>
             </w:r>
             <w:r>
               <w:rPr>
@@ -1263,6 +1420,19 @@
                 <w:sz w:val="19"/>
               </w:rPr>
               <w:t>).</w:t>
+            </w:r>
+          </w:p>
+          <w:p>
+            <w:pPr>
+              <w:spacing w:before="20" w:after="40" w:line="276" w:lineRule="auto"/>
+              <w:ind w:left="216"/>
+            </w:pPr>
+            <w:r>
+              <w:rPr>
+                <w:rFonts w:ascii="Calibri" w:hAnsi="Calibri"/>
+                <w:sz w:val="19"/>
+              </w:rPr>
+              <w:t>• Tài liệu quy tắc nghiệp vụ quy đổi đơn vị đo lường.</w:t>
             </w:r>
           </w:p>
         </w:tc>
@@ -1292,7 +1462,7 @@
                 <w:b/>
                 <w:sz w:val="19"/>
               </w:rPr>
-              <w:t>Vy Tran</w:t>
+              <w:t>Nam Nguyen</w:t>
             </w:r>
           </w:p>
         </w:tc>
@@ -1317,7 +1487,32 @@
                 <w:b/>
                 <w:sz w:val="19"/>
               </w:rPr>
-              <w:t>Domain B — Warehouse Structure</w:t>
+              <w:t>Domain A — Authentication &amp; RBAC</w:t>
+            </w:r>
+          </w:p>
+          <w:p>
+            <w:pPr>
+              <w:spacing w:before="20" w:after="40" w:line="276" w:lineRule="auto"/>
+            </w:pPr>
+            <w:r>
+              <w:rPr>
+                <w:rFonts w:ascii="Calibri" w:hAnsi="Calibri"/>
+                <w:sz w:val="19"/>
+              </w:rPr>
+              <w:t>&amp;</w:t>
+            </w:r>
+          </w:p>
+          <w:p>
+            <w:pPr>
+              <w:spacing w:before="20" w:after="40" w:line="276" w:lineRule="auto"/>
+            </w:pPr>
+            <w:r>
+              <w:rPr>
+                <w:rFonts w:ascii="Calibri" w:hAnsi="Calibri"/>
+                <w:b/>
+                <w:sz w:val="19"/>
+              </w:rPr>
+              <w:t>Domain E — Stock Ledger &amp; Movement</w:t>
             </w:r>
           </w:p>
         </w:tc>
@@ -1342,7 +1537,22 @@
                 <w:rFonts w:ascii="Calibri" w:hAnsi="Calibri"/>
                 <w:sz w:val="19"/>
               </w:rPr>
-              <w:t>• Phân tích cấu trúc phân cấp vật lý của kho hàng theo mô hình cây: Kho tổng (Warehouse) → Khu vực (Zone) → Dãy (Aisle) → Kệ (Rack) → Ô lưu trữ (Bin).</w:t>
+              <w:t>• Phân tích cấu trúc bảng Quản lý User, Role, Permission và cơ chế phân quyền theo phạm vi Kho hàng (</w:t>
+            </w:r>
+            <w:r>
+              <w:rPr>
+                <w:rFonts w:ascii="Consolas" w:hAnsi="Consolas"/>
+                <w:color w:val="9C4124"/>
+                <w:sz w:val="18"/>
+              </w:rPr>
+              <w:t>warehouse_id</w:t>
+            </w:r>
+            <w:r>
+              <w:rPr>
+                <w:rFonts w:ascii="Calibri" w:hAnsi="Calibri"/>
+                <w:sz w:val="19"/>
+              </w:rPr>
+              <w:t>).</w:t>
             </w:r>
           </w:p>
           <w:p>
@@ -1355,7 +1565,7 @@
                 <w:rFonts w:ascii="Calibri" w:hAnsi="Calibri"/>
                 <w:sz w:val="19"/>
               </w:rPr>
-              <w:t>• Phân loại mục đích sử dụng của vị trí (</w:t>
+              <w:t>• Thiết kế tài liệu phân loại các loại giao dịch kho (</w:t>
             </w:r>
             <w:r>
               <w:rPr>
@@ -1363,14 +1573,27 @@
                 <w:color w:val="9C4124"/>
                 <w:sz w:val="18"/>
               </w:rPr>
-              <w:t>purpose</w:t>
-            </w:r>
-            <w:r>
-              <w:rPr>
-                <w:rFonts w:ascii="Calibri" w:hAnsi="Calibri"/>
-                <w:sz w:val="19"/>
-              </w:rPr>
-              <w:t>: STORAGE, RECEIVING, STAGING, QC, DAMAGED) và cờ lấy hàng (</w:t>
+              <w:t>movement_type_code</w:t>
+            </w:r>
+            <w:r>
+              <w:rPr>
+                <w:rFonts w:ascii="Calibri" w:hAnsi="Calibri"/>
+                <w:sz w:val="19"/>
+              </w:rPr>
+              <w:t>: RECEIPT, SHIPMENT, TRANSFER, ADJUST...).</w:t>
+            </w:r>
+          </w:p>
+          <w:p>
+            <w:pPr>
+              <w:spacing w:before="20" w:after="40" w:line="276" w:lineRule="auto"/>
+              <w:ind w:left="216"/>
+            </w:pPr>
+            <w:r>
+              <w:rPr>
+                <w:rFonts w:ascii="Calibri" w:hAnsi="Calibri"/>
+                <w:sz w:val="19"/>
+              </w:rPr>
+              <w:t xml:space="preserve">• Xây dựng nguyên tắc sổ cái </w:t>
             </w:r>
             <w:r>
               <w:rPr>
@@ -1378,14 +1601,14 @@
                 <w:color w:val="9C4124"/>
                 <w:sz w:val="18"/>
               </w:rPr>
-              <w:t>is_pickable</w:t>
-            </w:r>
-            <w:r>
-              <w:rPr>
-                <w:rFonts w:ascii="Calibri" w:hAnsi="Calibri"/>
-                <w:sz w:val="19"/>
-              </w:rPr>
-              <w:t>).</w:t>
+              <w:t>stock_ledger</w:t>
+            </w:r>
+            <w:r>
+              <w:rPr>
+                <w:rFonts w:ascii="Calibri" w:hAnsi="Calibri"/>
+                <w:sz w:val="19"/>
+              </w:rPr>
+              <w:t xml:space="preserve"> bất biến (Append-only).</w:t>
             </w:r>
           </w:p>
         </w:tc>
@@ -1410,7 +1633,7 @@
                 <w:rFonts w:ascii="Calibri" w:hAnsi="Calibri"/>
                 <w:sz w:val="19"/>
               </w:rPr>
-              <w:t>• Tài liệu &amp; ERD Domain B (</w:t>
+              <w:t>• Tài liệu &amp; ERD Domain A (</w:t>
             </w:r>
             <w:r>
               <w:rPr>
@@ -1418,7 +1641,7 @@
                 <w:color w:val="9C4124"/>
                 <w:sz w:val="18"/>
               </w:rPr>
-              <w:t>warehouses</w:t>
+              <w:t>users</w:t>
             </w:r>
             <w:r>
               <w:rPr>
@@ -1433,7 +1656,37 @@
                 <w:color w:val="9C4124"/>
                 <w:sz w:val="18"/>
               </w:rPr>
-              <w:t>locations</w:t>
+              <w:t>roles</w:t>
+            </w:r>
+            <w:r>
+              <w:rPr>
+                <w:rFonts w:ascii="Calibri" w:hAnsi="Calibri"/>
+                <w:sz w:val="19"/>
+              </w:rPr>
+              <w:t xml:space="preserve">, </w:t>
+            </w:r>
+            <w:r>
+              <w:rPr>
+                <w:rFonts w:ascii="Consolas" w:hAnsi="Consolas"/>
+                <w:color w:val="9C4124"/>
+                <w:sz w:val="18"/>
+              </w:rPr>
+              <w:t>permissions</w:t>
+            </w:r>
+            <w:r>
+              <w:rPr>
+                <w:rFonts w:ascii="Calibri" w:hAnsi="Calibri"/>
+                <w:sz w:val="19"/>
+              </w:rPr>
+              <w:t xml:space="preserve">, </w:t>
+            </w:r>
+            <w:r>
+              <w:rPr>
+                <w:rFonts w:ascii="Consolas" w:hAnsi="Consolas"/>
+                <w:color w:val="9C4124"/>
+                <w:sz w:val="18"/>
+              </w:rPr>
+              <w:t>user_roles</w:t>
             </w:r>
             <w:r>
               <w:rPr>
@@ -1453,7 +1706,37 @@
                 <w:rFonts w:ascii="Calibri" w:hAnsi="Calibri"/>
                 <w:sz w:val="19"/>
               </w:rPr>
-              <w:t>• Quy chuẩn phân cấp mã vị trí kho (Location hierarchy &amp; Barcode scheme).</w:t>
+              <w:t>• Tài liệu &amp; ERD Domain E (</w:t>
+            </w:r>
+            <w:r>
+              <w:rPr>
+                <w:rFonts w:ascii="Consolas" w:hAnsi="Consolas"/>
+                <w:color w:val="9C4124"/>
+                <w:sz w:val="18"/>
+              </w:rPr>
+              <w:t>stock_ledger</w:t>
+            </w:r>
+            <w:r>
+              <w:rPr>
+                <w:rFonts w:ascii="Calibri" w:hAnsi="Calibri"/>
+                <w:sz w:val="19"/>
+              </w:rPr>
+              <w:t xml:space="preserve">, </w:t>
+            </w:r>
+            <w:r>
+              <w:rPr>
+                <w:rFonts w:ascii="Consolas" w:hAnsi="Consolas"/>
+                <w:color w:val="9C4124"/>
+                <w:sz w:val="18"/>
+              </w:rPr>
+              <w:t>movement_types</w:t>
+            </w:r>
+            <w:r>
+              <w:rPr>
+                <w:rFonts w:ascii="Calibri" w:hAnsi="Calibri"/>
+                <w:sz w:val="19"/>
+              </w:rPr>
+              <w:t>).</w:t>
             </w:r>
           </w:p>
         </w:tc>
@@ -1483,7 +1766,7 @@
                 <w:b/>
                 <w:sz w:val="19"/>
               </w:rPr>
-              <w:t>Trung Pham</w:t>
+              <w:t>Vy Tran</w:t>
             </w:r>
           </w:p>
         </w:tc>
@@ -1508,7 +1791,7 @@
                 <w:b/>
                 <w:sz w:val="19"/>
               </w:rPr>
-              <w:t>Domain C — Product &amp; Supplier</w:t>
+              <w:t>Domain B — Warehouse Structure</w:t>
             </w:r>
           </w:p>
         </w:tc>
@@ -1533,37 +1816,7 @@
                 <w:rFonts w:ascii="Calibri" w:hAnsi="Calibri"/>
                 <w:sz w:val="19"/>
               </w:rPr>
-              <w:t>• Phân tích quản lý danh mục Hàng hóa (SKU), Đơn vị tính cơ bản (</w:t>
-            </w:r>
-            <w:r>
-              <w:rPr>
-                <w:rFonts w:ascii="Consolas" w:hAnsi="Consolas"/>
-                <w:color w:val="9C4124"/>
-                <w:sz w:val="18"/>
-              </w:rPr>
-              <w:t>base_uom</w:t>
-            </w:r>
-            <w:r>
-              <w:rPr>
-                <w:rFonts w:ascii="Calibri" w:hAnsi="Calibri"/>
-                <w:sz w:val="19"/>
-              </w:rPr>
-              <w:t>), Bảng tỷ lệ quy đổi đơn vị (</w:t>
-            </w:r>
-            <w:r>
-              <w:rPr>
-                <w:rFonts w:ascii="Consolas" w:hAnsi="Consolas"/>
-                <w:color w:val="9C4124"/>
-                <w:sz w:val="18"/>
-              </w:rPr>
-              <w:t>sku_uom_conversions</w:t>
-            </w:r>
-            <w:r>
-              <w:rPr>
-                <w:rFonts w:ascii="Calibri" w:hAnsi="Calibri"/>
-                <w:sz w:val="19"/>
-              </w:rPr>
-              <w:t>).</w:t>
+              <w:t>• Phân tích cấu trúc phân cấp vật lý của kho hàng theo mô hình cây: Kho tổng (Warehouse) → Khu vực (Zone) → Dãy (Aisle) → Kệ (Rack) → Ô lưu trữ (Bin).</w:t>
             </w:r>
           </w:p>
           <w:p>
@@ -1576,7 +1829,7 @@
                 <w:rFonts w:ascii="Calibri" w:hAnsi="Calibri"/>
                 <w:sz w:val="19"/>
               </w:rPr>
-              <w:t>• Phân tích cấu trúc quản lý Nhà cung cấp (Suppliers), liên kết sản phẩm phân phối (</w:t>
+              <w:t>• Phân loại mục đích sử dụng của vị trí (</w:t>
             </w:r>
             <w:r>
               <w:rPr>
@@ -1584,14 +1837,14 @@
                 <w:color w:val="9C4124"/>
                 <w:sz w:val="18"/>
               </w:rPr>
-              <w:t>sku_suppliers</w:t>
-            </w:r>
-            <w:r>
-              <w:rPr>
-                <w:rFonts w:ascii="Calibri" w:hAnsi="Calibri"/>
-                <w:sz w:val="19"/>
-              </w:rPr>
-              <w:t>) và mã vạch (</w:t>
+              <w:t>purpose</w:t>
+            </w:r>
+            <w:r>
+              <w:rPr>
+                <w:rFonts w:ascii="Calibri" w:hAnsi="Calibri"/>
+                <w:sz w:val="19"/>
+              </w:rPr>
+              <w:t>: STORAGE, RECEIVING, STAGING, QC, DAMAGED) và cờ lấy hàng (</w:t>
             </w:r>
             <w:r>
               <w:rPr>
@@ -1599,7 +1852,7 @@
                 <w:color w:val="9C4124"/>
                 <w:sz w:val="18"/>
               </w:rPr>
-              <w:t>sku_barcodes</w:t>
+              <w:t>is_pickable</w:t>
             </w:r>
             <w:r>
               <w:rPr>
@@ -1607,49 +1860,6 @@
                 <w:sz w:val="19"/>
               </w:rPr>
               <w:t>).</w:t>
-            </w:r>
-          </w:p>
-          <w:p>
-            <w:pPr>
-              <w:spacing w:before="20" w:after="40" w:line="276" w:lineRule="auto"/>
-              <w:ind w:left="216"/>
-            </w:pPr>
-            <w:r>
-              <w:rPr>
-                <w:rFonts w:ascii="Calibri" w:hAnsi="Calibri"/>
-                <w:sz w:val="19"/>
-              </w:rPr>
-              <w:t xml:space="preserve">• Đưa ra các thuộc tính kiểm soát: </w:t>
-            </w:r>
-            <w:r>
-              <w:rPr>
-                <w:rFonts w:ascii="Consolas" w:hAnsi="Consolas"/>
-                <w:color w:val="9C4124"/>
-                <w:sz w:val="18"/>
-              </w:rPr>
-              <w:t>is_lot_tracked</w:t>
-            </w:r>
-            <w:r>
-              <w:rPr>
-                <w:rFonts w:ascii="Calibri" w:hAnsi="Calibri"/>
-                <w:sz w:val="19"/>
-              </w:rPr>
-              <w:t xml:space="preserve">, </w:t>
-            </w:r>
-            <w:r>
-              <w:rPr>
-                <w:rFonts w:ascii="Consolas" w:hAnsi="Consolas"/>
-                <w:color w:val="9C4124"/>
-                <w:sz w:val="18"/>
-              </w:rPr>
-              <w:t>is_serial_tracked</w:t>
-            </w:r>
-            <w:r>
-              <w:rPr>
-                <w:rFonts w:ascii="Calibri" w:hAnsi="Calibri"/>
-                <w:sz w:val="19"/>
-              </w:rPr>
-              <w:t>, trọng lượng, thể tích sản phẩm.</w:t>
             </w:r>
           </w:p>
         </w:tc>
@@ -1674,7 +1884,7 @@
                 <w:rFonts w:ascii="Calibri" w:hAnsi="Calibri"/>
                 <w:sz w:val="19"/>
               </w:rPr>
-              <w:t>• Tài liệu &amp; ERD Domain C (</w:t>
+              <w:t>• Tài liệu &amp; ERD Domain B (</w:t>
             </w:r>
             <w:r>
               <w:rPr>
@@ -1682,7 +1892,7 @@
                 <w:color w:val="9C4124"/>
                 <w:sz w:val="18"/>
               </w:rPr>
-              <w:t>skus</w:t>
+              <w:t>warehouses</w:t>
             </w:r>
             <w:r>
               <w:rPr>
@@ -1697,67 +1907,7 @@
                 <w:color w:val="9C4124"/>
                 <w:sz w:val="18"/>
               </w:rPr>
-              <w:t>uoms</w:t>
-            </w:r>
-            <w:r>
-              <w:rPr>
-                <w:rFonts w:ascii="Calibri" w:hAnsi="Calibri"/>
-                <w:sz w:val="19"/>
-              </w:rPr>
-              <w:t xml:space="preserve">, </w:t>
-            </w:r>
-            <w:r>
-              <w:rPr>
-                <w:rFonts w:ascii="Consolas" w:hAnsi="Consolas"/>
-                <w:color w:val="9C4124"/>
-                <w:sz w:val="18"/>
-              </w:rPr>
-              <w:t>sku_uom_conversions</w:t>
-            </w:r>
-            <w:r>
-              <w:rPr>
-                <w:rFonts w:ascii="Calibri" w:hAnsi="Calibri"/>
-                <w:sz w:val="19"/>
-              </w:rPr>
-              <w:t xml:space="preserve">, </w:t>
-            </w:r>
-            <w:r>
-              <w:rPr>
-                <w:rFonts w:ascii="Consolas" w:hAnsi="Consolas"/>
-                <w:color w:val="9C4124"/>
-                <w:sz w:val="18"/>
-              </w:rPr>
-              <w:t>suppliers</w:t>
-            </w:r>
-            <w:r>
-              <w:rPr>
-                <w:rFonts w:ascii="Calibri" w:hAnsi="Calibri"/>
-                <w:sz w:val="19"/>
-              </w:rPr>
-              <w:t xml:space="preserve">, </w:t>
-            </w:r>
-            <w:r>
-              <w:rPr>
-                <w:rFonts w:ascii="Consolas" w:hAnsi="Consolas"/>
-                <w:color w:val="9C4124"/>
-                <w:sz w:val="18"/>
-              </w:rPr>
-              <w:t>sku_suppliers</w:t>
-            </w:r>
-            <w:r>
-              <w:rPr>
-                <w:rFonts w:ascii="Calibri" w:hAnsi="Calibri"/>
-                <w:sz w:val="19"/>
-              </w:rPr>
-              <w:t xml:space="preserve">, </w:t>
-            </w:r>
-            <w:r>
-              <w:rPr>
-                <w:rFonts w:ascii="Consolas" w:hAnsi="Consolas"/>
-                <w:color w:val="9C4124"/>
-                <w:sz w:val="18"/>
-              </w:rPr>
-              <w:t>sku_barcodes</w:t>
+              <w:t>locations</w:t>
             </w:r>
             <w:r>
               <w:rPr>
@@ -1777,7 +1927,7 @@
                 <w:rFonts w:ascii="Calibri" w:hAnsi="Calibri"/>
                 <w:sz w:val="19"/>
               </w:rPr>
-              <w:t>• Tài liệu quy tắc nghiệp vụ quy đổi đơn vị đo lường.</w:t>
+              <w:t>• Quy chuẩn phân cấp mã vị trí kho (Location hierarchy &amp; Barcode scheme).</w:t>
             </w:r>
           </w:p>
         </w:tc>
@@ -2309,7 +2459,7 @@
           <w:rFonts w:ascii="Calibri" w:hAnsi="Calibri"/>
           <w:sz w:val="21"/>
         </w:rPr>
-        <w:t>Hoàn thành giao diện người dùng tương ứng cho từng vai trò.</w:t>
+        <w:t>Hoàn thành giao diện người dùng tương ứng cho từng vai trò và tổ chức Demo thành công.</w:t>
       </w:r>
     </w:p>
     <w:p>
@@ -2457,7 +2607,7 @@
                 <w:b/>
                 <w:sz w:val="19"/>
               </w:rPr>
-              <w:t>Thuan Le</w:t>
+              <w:t>Trung Pham</w:t>
             </w:r>
           </w:p>
         </w:tc>
@@ -2482,7 +2632,7 @@
                 <w:b/>
                 <w:sz w:val="19"/>
               </w:rPr>
-              <w:t>Database , Core Ledger, Kiểm kê &amp; Mã QR, Chuyển kho (nền móng)</w:t>
+              <w:t>Team Leader (Lập Plan, Rà soát, Kiểm thử thủ công) &amp; Master Data, NCC, Bút toán đảo</w:t>
             </w:r>
           </w:p>
         </w:tc>
@@ -2507,44 +2657,7 @@
                 <w:b/>
                 <w:sz w:val="19"/>
               </w:rPr>
-              <w:t>Tuần 2:</w:t>
-            </w:r>
-            <w:r>
-              <w:rPr>
-                <w:rFonts w:ascii="Calibri" w:hAnsi="Calibri"/>
-                <w:sz w:val="19"/>
-              </w:rPr>
-              <w:t xml:space="preserve"> Cấu hình kết nối DB PostgreSQL, Prisma Client, viết script </w:t>
-            </w:r>
-            <w:r>
-              <w:rPr>
-                <w:rFonts w:ascii="Consolas" w:hAnsi="Consolas"/>
-                <w:color w:val="9C4124"/>
-                <w:sz w:val="18"/>
-              </w:rPr>
-              <w:t>seed</w:t>
-            </w:r>
-            <w:r>
-              <w:rPr>
-                <w:rFonts w:ascii="Calibri" w:hAnsi="Calibri"/>
-                <w:sz w:val="19"/>
-              </w:rPr>
-              <w:t xml:space="preserve"> khởi tạo user </w:t>
-            </w:r>
-            <w:r>
-              <w:rPr>
-                <w:rFonts w:ascii="Consolas" w:hAnsi="Consolas"/>
-                <w:color w:val="9C4124"/>
-                <w:sz w:val="18"/>
-              </w:rPr>
-              <w:t>admin</w:t>
-            </w:r>
-            <w:r>
-              <w:rPr>
-                <w:rFonts w:ascii="Calibri" w:hAnsi="Calibri"/>
-                <w:sz w:val="19"/>
-              </w:rPr>
-              <w:t>, danh sách Roles chuẩn và kho mẫu.</w:t>
+              <w:t>Nhiệm vụ Leader:</w:t>
             </w:r>
           </w:p>
           <w:p>
@@ -2557,7 +2670,7 @@
                 <w:rFonts w:ascii="Calibri" w:hAnsi="Calibri"/>
                 <w:sz w:val="19"/>
               </w:rPr>
-              <w:t xml:space="preserve">• Trực tiếp xây dựng </w:t>
+              <w:t>• Lập kế hoạch chi tiết Tuần 2, Tuần 3, Tuần 4 (</w:t>
             </w:r>
             <w:r>
               <w:rPr>
@@ -2565,14 +2678,14 @@
                 <w:color w:val="9C4124"/>
                 <w:sz w:val="18"/>
               </w:rPr>
-              <w:t>InventoryLedgerService</w:t>
-            </w:r>
-            <w:r>
-              <w:rPr>
-                <w:rFonts w:ascii="Calibri" w:hAnsi="Calibri"/>
-                <w:sz w:val="19"/>
-              </w:rPr>
-              <w:t xml:space="preserve"> (</w:t>
+              <w:t>plan_week2.md</w:t>
+            </w:r>
+            <w:r>
+              <w:rPr>
+                <w:rFonts w:ascii="Calibri" w:hAnsi="Calibri"/>
+                <w:sz w:val="19"/>
+              </w:rPr>
+              <w:t xml:space="preserve">, </w:t>
             </w:r>
             <w:r>
               <w:rPr>
@@ -2580,14 +2693,29 @@
                 <w:color w:val="9C4124"/>
                 <w:sz w:val="18"/>
               </w:rPr>
-              <w:t>StockLedgerService</w:t>
-            </w:r>
-            <w:r>
-              <w:rPr>
-                <w:rFonts w:ascii="Calibri" w:hAnsi="Calibri"/>
-                <w:sz w:val="19"/>
-              </w:rPr>
-              <w:t>)</w:t>
+              <w:t>plan_week3.md</w:t>
+            </w:r>
+            <w:r>
+              <w:rPr>
+                <w:rFonts w:ascii="Calibri" w:hAnsi="Calibri"/>
+                <w:sz w:val="19"/>
+              </w:rPr>
+              <w:t xml:space="preserve">, </w:t>
+            </w:r>
+            <w:r>
+              <w:rPr>
+                <w:rFonts w:ascii="Consolas" w:hAnsi="Consolas"/>
+                <w:color w:val="9C4124"/>
+                <w:sz w:val="18"/>
+              </w:rPr>
+              <w:t>plan_week4.md</w:t>
+            </w:r>
+            <w:r>
+              <w:rPr>
+                <w:rFonts w:ascii="Calibri" w:hAnsi="Calibri"/>
+                <w:sz w:val="19"/>
+              </w:rPr>
+              <w:t>) và phân bổ đầu việc rõ ràng cho từng thành viên.</w:t>
             </w:r>
           </w:p>
           <w:p>
@@ -2600,22 +2728,7 @@
                 <w:rFonts w:ascii="Calibri" w:hAnsi="Calibri"/>
                 <w:sz w:val="19"/>
               </w:rPr>
-              <w:t xml:space="preserve">• Xử lý mọi biến động tồn kho qua Transaction, Append-only (cấm UPDATE/DELETE </w:t>
-            </w:r>
-            <w:r>
-              <w:rPr>
-                <w:rFonts w:ascii="Consolas" w:hAnsi="Consolas"/>
-                <w:color w:val="9C4124"/>
-                <w:sz w:val="18"/>
-              </w:rPr>
-              <w:t>stock_ledger</w:t>
-            </w:r>
-            <w:r>
-              <w:rPr>
-                <w:rFonts w:ascii="Calibri" w:hAnsi="Calibri"/>
-                <w:sz w:val="19"/>
-              </w:rPr>
-              <w:t>), và cơ chế Lock chống chạy trùng (Concurrency).</w:t>
+              <w:t>• Lắng nghe phản hồi từ các bạn, điều chỉnh yêu cầu kỹ thuật để tối ưu hóa tiến độ.</w:t>
             </w:r>
           </w:p>
           <w:p>
@@ -2628,87 +2741,7 @@
                 <w:rFonts w:ascii="Calibri" w:hAnsi="Calibri"/>
                 <w:sz w:val="19"/>
               </w:rPr>
-              <w:t xml:space="preserve">• Xây dựng API tra cứu tồn kho </w:t>
-            </w:r>
-            <w:r>
-              <w:rPr>
-                <w:rFonts w:ascii="Consolas" w:hAnsi="Consolas"/>
-                <w:color w:val="9C4124"/>
-                <w:sz w:val="18"/>
-              </w:rPr>
-              <w:t>/api/inventory</w:t>
-            </w:r>
-            <w:r>
-              <w:rPr>
-                <w:rFonts w:ascii="Calibri" w:hAnsi="Calibri"/>
-                <w:sz w:val="19"/>
-              </w:rPr>
-              <w:t xml:space="preserve"> và lịch sử thẻ kho </w:t>
-            </w:r>
-            <w:r>
-              <w:rPr>
-                <w:rFonts w:ascii="Consolas" w:hAnsi="Consolas"/>
-                <w:color w:val="9C4124"/>
-                <w:sz w:val="18"/>
-              </w:rPr>
-              <w:t>/api/stock-ledger</w:t>
-            </w:r>
-            <w:r>
-              <w:rPr>
-                <w:rFonts w:ascii="Calibri" w:hAnsi="Calibri"/>
-                <w:sz w:val="19"/>
-              </w:rPr>
-              <w:t>.</w:t>
-            </w:r>
-          </w:p>
-          <w:p>
-            <w:pPr>
-              <w:spacing w:before="20" w:after="40" w:line="276" w:lineRule="auto"/>
-            </w:pPr>
-            <w:r>
-              <w:rPr>
-                <w:rFonts w:ascii="Calibri" w:hAnsi="Calibri"/>
-                <w:b/>
-                <w:sz w:val="19"/>
-              </w:rPr>
-              <w:t>Tuần 3:</w:t>
-            </w:r>
-            <w:r>
-              <w:rPr>
-                <w:rFonts w:ascii="Calibri" w:hAnsi="Calibri"/>
-                <w:sz w:val="19"/>
-              </w:rPr>
-              <w:t xml:space="preserve"> Xây dựng API Phân hệ Kiểm kê (</w:t>
-            </w:r>
-            <w:r>
-              <w:rPr>
-                <w:rFonts w:ascii="Consolas" w:hAnsi="Consolas"/>
-                <w:color w:val="9C4124"/>
-                <w:sz w:val="18"/>
-              </w:rPr>
-              <w:t>Cycle Count</w:t>
-            </w:r>
-            <w:r>
-              <w:rPr>
-                <w:rFonts w:ascii="Calibri" w:hAnsi="Calibri"/>
-                <w:sz w:val="19"/>
-              </w:rPr>
-              <w:t xml:space="preserve">: </w:t>
-            </w:r>
-            <w:r>
-              <w:rPr>
-                <w:rFonts w:ascii="Consolas" w:hAnsi="Consolas"/>
-                <w:color w:val="9C4124"/>
-                <w:sz w:val="18"/>
-              </w:rPr>
-              <w:t>/api/cycle-counts</w:t>
-            </w:r>
-            <w:r>
-              <w:rPr>
-                <w:rFonts w:ascii="Calibri" w:hAnsi="Calibri"/>
-                <w:sz w:val="19"/>
-              </w:rPr>
-              <w:t>) gồm tạo đợt kiểm kê theo vị trí/kho và nộp kết quả đếm thực tế.</w:t>
+              <w:t>• Thường xuyên rà soát kết quả code, đối soát API và cấu trúc CSDL của các thành viên trước khi tích hợp.</w:t>
             </w:r>
           </w:p>
           <w:p>
@@ -2721,22 +2754,22 @@
                 <w:rFonts w:ascii="Calibri" w:hAnsi="Calibri"/>
                 <w:sz w:val="19"/>
               </w:rPr>
-              <w:t>• Xây dựng API truy xuất thông tin in Mã QR hàng hóa (</w:t>
-            </w:r>
-            <w:r>
-              <w:rPr>
-                <w:rFonts w:ascii="Consolas" w:hAnsi="Consolas"/>
-                <w:color w:val="9C4124"/>
-                <w:sz w:val="18"/>
-              </w:rPr>
-              <w:t>/api/qrcodes/sku/.../uom/...</w:t>
-            </w:r>
-            <w:r>
-              <w:rPr>
-                <w:rFonts w:ascii="Calibri" w:hAnsi="Calibri"/>
-                <w:sz w:val="19"/>
-              </w:rPr>
-              <w:t>).</w:t>
+              <w:t xml:space="preserve">• </w:t>
+            </w:r>
+            <w:r>
+              <w:rPr>
+                <w:rFonts w:ascii="Calibri" w:hAnsi="Calibri"/>
+                <w:b/>
+                <w:sz w:val="19"/>
+              </w:rPr>
+              <w:t>Trực tiếp kiểm thử thủ công (Manual Testing):</w:t>
+            </w:r>
+            <w:r>
+              <w:rPr>
+                <w:rFonts w:ascii="Calibri" w:hAnsi="Calibri"/>
+                <w:sz w:val="19"/>
+              </w:rPr>
+              <w:t xml:space="preserve"> Test từng tính năng trên giao diện web (tạo tài khoản, tạo kho/vị trí, nhập hàng, kiểm kê, giữ chỗ xuất hàng) để phát hiện bug logic và trải nghiệm trước khi Demo.</w:t>
             </w:r>
           </w:p>
           <w:p>
@@ -2749,14 +2782,35 @@
                 <w:b/>
                 <w:sz w:val="19"/>
               </w:rPr>
-              <w:t>Tuần 4 :</w:t>
-            </w:r>
-            <w:r>
-              <w:rPr>
-                <w:rFonts w:ascii="Calibri" w:hAnsi="Calibri"/>
-                <w:sz w:val="19"/>
-              </w:rPr>
-              <w:t xml:space="preserve"> Thiết kế cấu trúc CSDL và viết API Chuyển kho liên trạm (</w:t>
+              <w:t>Nhiệm vụ Backend:</w:t>
+            </w:r>
+          </w:p>
+          <w:p>
+            <w:pPr>
+              <w:spacing w:before="20" w:after="40" w:line="276" w:lineRule="auto"/>
+              <w:ind w:left="216"/>
+            </w:pPr>
+            <w:r>
+              <w:rPr>
+                <w:rFonts w:ascii="Calibri" w:hAnsi="Calibri"/>
+                <w:sz w:val="19"/>
+              </w:rPr>
+              <w:t xml:space="preserve">• </w:t>
+            </w:r>
+            <w:r>
+              <w:rPr>
+                <w:rFonts w:ascii="Calibri" w:hAnsi="Calibri"/>
+                <w:b/>
+                <w:sz w:val="19"/>
+              </w:rPr>
+              <w:t>Tuần 2:</w:t>
+            </w:r>
+            <w:r>
+              <w:rPr>
+                <w:rFonts w:ascii="Calibri" w:hAnsi="Calibri"/>
+                <w:sz w:val="19"/>
+              </w:rPr>
+              <w:t xml:space="preserve"> Phát triển toàn bộ API Quản lý Kho hàng (</w:t>
             </w:r>
             <w:r>
               <w:rPr>
@@ -2764,14 +2818,14 @@
                 <w:color w:val="9C4124"/>
                 <w:sz w:val="18"/>
               </w:rPr>
-              <w:t>/api/transfers</w:t>
-            </w:r>
-            <w:r>
-              <w:rPr>
-                <w:rFonts w:ascii="Calibri" w:hAnsi="Calibri"/>
-                <w:sz w:val="19"/>
-              </w:rPr>
-              <w:t xml:space="preserve">) qua kho trung gian ảo </w:t>
+              <w:t>/api/warehouses</w:t>
+            </w:r>
+            <w:r>
+              <w:rPr>
+                <w:rFonts w:ascii="Calibri" w:hAnsi="Calibri"/>
+                <w:sz w:val="19"/>
+              </w:rPr>
+              <w:t>), API Cây vị trí kho (</w:t>
             </w:r>
             <w:r>
               <w:rPr>
@@ -2779,14 +2833,190 @@
                 <w:color w:val="9C4124"/>
                 <w:sz w:val="18"/>
               </w:rPr>
-              <w:t>TRANSIT</w:t>
-            </w:r>
-            <w:r>
-              <w:rPr>
-                <w:rFonts w:ascii="Calibri" w:hAnsi="Calibri"/>
-                <w:sz w:val="19"/>
-              </w:rPr>
-              <w:t>.</w:t>
+              <w:t>/api/locations</w:t>
+            </w:r>
+            <w:r>
+              <w:rPr>
+                <w:rFonts w:ascii="Calibri" w:hAnsi="Calibri"/>
+                <w:sz w:val="19"/>
+              </w:rPr>
+              <w:t>), API Đơn vị tính (</w:t>
+            </w:r>
+            <w:r>
+              <w:rPr>
+                <w:rFonts w:ascii="Consolas" w:hAnsi="Consolas"/>
+                <w:color w:val="9C4124"/>
+                <w:sz w:val="18"/>
+              </w:rPr>
+              <w:t>/api/uoms</w:t>
+            </w:r>
+            <w:r>
+              <w:rPr>
+                <w:rFonts w:ascii="Calibri" w:hAnsi="Calibri"/>
+                <w:sz w:val="19"/>
+              </w:rPr>
+              <w:t>), và API Danh mục Sản phẩm (</w:t>
+            </w:r>
+            <w:r>
+              <w:rPr>
+                <w:rFonts w:ascii="Consolas" w:hAnsi="Consolas"/>
+                <w:color w:val="9C4124"/>
+                <w:sz w:val="18"/>
+              </w:rPr>
+              <w:t>/api/skus</w:t>
+            </w:r>
+            <w:r>
+              <w:rPr>
+                <w:rFonts w:ascii="Calibri" w:hAnsi="Calibri"/>
+                <w:sz w:val="19"/>
+              </w:rPr>
+              <w:t xml:space="preserve"> &amp; quy đổi đơn vị tính).</w:t>
+            </w:r>
+          </w:p>
+          <w:p>
+            <w:pPr>
+              <w:spacing w:before="20" w:after="40" w:line="276" w:lineRule="auto"/>
+              <w:ind w:left="216"/>
+            </w:pPr>
+            <w:r>
+              <w:rPr>
+                <w:rFonts w:ascii="Calibri" w:hAnsi="Calibri"/>
+                <w:sz w:val="19"/>
+              </w:rPr>
+              <w:t xml:space="preserve">• </w:t>
+            </w:r>
+            <w:r>
+              <w:rPr>
+                <w:rFonts w:ascii="Calibri" w:hAnsi="Calibri"/>
+                <w:b/>
+                <w:sz w:val="19"/>
+              </w:rPr>
+              <w:t>Tuần 3:</w:t>
+            </w:r>
+            <w:r>
+              <w:rPr>
+                <w:rFonts w:ascii="Calibri" w:hAnsi="Calibri"/>
+                <w:sz w:val="19"/>
+              </w:rPr>
+              <w:t xml:space="preserve"> Xây dựng toàn bộ phân hệ Quản lý Nhà cung cấp &amp; Đối tác (</w:t>
+            </w:r>
+            <w:r>
+              <w:rPr>
+                <w:rFonts w:ascii="Consolas" w:hAnsi="Consolas"/>
+                <w:color w:val="9C4124"/>
+                <w:sz w:val="18"/>
+              </w:rPr>
+              <w:t>/api/suppliers</w:t>
+            </w:r>
+            <w:r>
+              <w:rPr>
+                <w:rFonts w:ascii="Calibri" w:hAnsi="Calibri"/>
+                <w:sz w:val="19"/>
+              </w:rPr>
+              <w:t>): Thêm, sửa, xóa, tìm kiếm nhà cung cấp; API gán mã SKU của nhà cung cấp (</w:t>
+            </w:r>
+            <w:r>
+              <w:rPr>
+                <w:rFonts w:ascii="Consolas" w:hAnsi="Consolas"/>
+                <w:color w:val="9C4124"/>
+                <w:sz w:val="18"/>
+              </w:rPr>
+              <w:t>/api/suppliers/{id}/skus</w:t>
+            </w:r>
+            <w:r>
+              <w:rPr>
+                <w:rFonts w:ascii="Calibri" w:hAnsi="Calibri"/>
+                <w:sz w:val="19"/>
+              </w:rPr>
+              <w:t>).</w:t>
+            </w:r>
+          </w:p>
+          <w:p>
+            <w:pPr>
+              <w:spacing w:before="20" w:after="40" w:line="276" w:lineRule="auto"/>
+              <w:ind w:left="216"/>
+            </w:pPr>
+            <w:r>
+              <w:rPr>
+                <w:rFonts w:ascii="Calibri" w:hAnsi="Calibri"/>
+                <w:sz w:val="19"/>
+              </w:rPr>
+              <w:t xml:space="preserve">• </w:t>
+            </w:r>
+            <w:r>
+              <w:rPr>
+                <w:rFonts w:ascii="Calibri" w:hAnsi="Calibri"/>
+                <w:b/>
+                <w:sz w:val="19"/>
+              </w:rPr>
+              <w:t>Tuần 4:</w:t>
+            </w:r>
+            <w:r>
+              <w:rPr>
+                <w:rFonts w:ascii="Calibri" w:hAnsi="Calibri"/>
+                <w:sz w:val="19"/>
+              </w:rPr>
+              <w:t xml:space="preserve"> Phát triển phân hệ Bút toán đảo (</w:t>
+            </w:r>
+            <w:r>
+              <w:rPr>
+                <w:rFonts w:ascii="Consolas" w:hAnsi="Consolas"/>
+                <w:color w:val="9C4124"/>
+                <w:sz w:val="18"/>
+              </w:rPr>
+              <w:t>Reversal</w:t>
+            </w:r>
+            <w:r>
+              <w:rPr>
+                <w:rFonts w:ascii="Calibri" w:hAnsi="Calibri"/>
+                <w:sz w:val="19"/>
+              </w:rPr>
+              <w:t xml:space="preserve">: </w:t>
+            </w:r>
+            <w:r>
+              <w:rPr>
+                <w:rFonts w:ascii="Consolas" w:hAnsi="Consolas"/>
+                <w:color w:val="9C4124"/>
+                <w:sz w:val="18"/>
+              </w:rPr>
+              <w:t>/api/reversals/requests</w:t>
+            </w:r>
+            <w:r>
+              <w:rPr>
+                <w:rFonts w:ascii="Calibri" w:hAnsi="Calibri"/>
+                <w:sz w:val="19"/>
+              </w:rPr>
+              <w:t>) gồm tạo yêu cầu đảo từ dòng thẻ kho sai và luồng trình Admin duyệt. Xây dựng API Điều chỉnh nhanh (</w:t>
+            </w:r>
+            <w:r>
+              <w:rPr>
+                <w:rFonts w:ascii="Consolas" w:hAnsi="Consolas"/>
+                <w:color w:val="9C4124"/>
+                <w:sz w:val="18"/>
+              </w:rPr>
+              <w:t>Quick Adjustment</w:t>
+            </w:r>
+            <w:r>
+              <w:rPr>
+                <w:rFonts w:ascii="Calibri" w:hAnsi="Calibri"/>
+                <w:sz w:val="19"/>
+              </w:rPr>
+              <w:t xml:space="preserve">) từ UI tồn kho với cơ chế </w:t>
+            </w:r>
+            <w:r>
+              <w:rPr>
+                <w:rFonts w:ascii="Consolas" w:hAnsi="Consolas"/>
+                <w:color w:val="9C4124"/>
+                <w:sz w:val="18"/>
+              </w:rPr>
+              <w:t>inventoryVersion</w:t>
+            </w:r>
+            <w:r>
+              <w:rPr>
+                <w:rFonts w:ascii="Calibri" w:hAnsi="Calibri"/>
+                <w:sz w:val="19"/>
+              </w:rPr>
+              <w:t xml:space="preserve"> kiểm soát xung đột (Optimistic Lock chặn 409).</w:t>
             </w:r>
           </w:p>
         </w:tc>
@@ -2816,7 +3046,7 @@
                 <w:b/>
                 <w:sz w:val="19"/>
               </w:rPr>
-              <w:t>Nam Nguyen</w:t>
+              <w:t>Thuan Le</w:t>
             </w:r>
           </w:p>
         </w:tc>
@@ -2841,7 +3071,7 @@
                 <w:b/>
                 <w:sz w:val="19"/>
               </w:rPr>
-              <w:t>Xác thực &amp; Người dùng, Nhập kho Inbound &amp; Putaway, Xuất kho (nền móng)</w:t>
+              <w:t>Database, Core Ledger, Kiểm kê &amp; Mã QR, Chuyển kho (nền móng)</w:t>
             </w:r>
           </w:p>
         </w:tc>
@@ -2873,7 +3103,7 @@
                 <w:rFonts w:ascii="Calibri" w:hAnsi="Calibri"/>
                 <w:sz w:val="19"/>
               </w:rPr>
-              <w:t xml:space="preserve"> Xây dựng toàn bộ phân hệ Xác thực: API Login (</w:t>
+              <w:t xml:space="preserve"> Cấu hình kết nối DB PostgreSQL, Prisma Client, viết script </w:t>
             </w:r>
             <w:r>
               <w:rPr>
@@ -2881,14 +3111,14 @@
                 <w:color w:val="9C4124"/>
                 <w:sz w:val="18"/>
               </w:rPr>
-              <w:t>POST /api/auth/login</w:t>
-            </w:r>
-            <w:r>
-              <w:rPr>
-                <w:rFonts w:ascii="Calibri" w:hAnsi="Calibri"/>
-                <w:sz w:val="19"/>
-              </w:rPr>
-              <w:t>), Lấy thông tin cá nhân (</w:t>
+              <w:t>seed</w:t>
+            </w:r>
+            <w:r>
+              <w:rPr>
+                <w:rFonts w:ascii="Calibri" w:hAnsi="Calibri"/>
+                <w:sz w:val="19"/>
+              </w:rPr>
+              <w:t xml:space="preserve"> khởi tạo user </w:t>
             </w:r>
             <w:r>
               <w:rPr>
@@ -2896,139 +3126,14 @@
                 <w:color w:val="9C4124"/>
                 <w:sz w:val="18"/>
               </w:rPr>
-              <w:t>GET /api/auth/me</w:t>
-            </w:r>
-            <w:r>
-              <w:rPr>
-                <w:rFonts w:ascii="Calibri" w:hAnsi="Calibri"/>
-                <w:sz w:val="19"/>
-              </w:rPr>
-              <w:t>), CRUD Người dùng (</w:t>
-            </w:r>
-            <w:r>
-              <w:rPr>
-                <w:rFonts w:ascii="Consolas" w:hAnsi="Consolas"/>
-                <w:color w:val="9C4124"/>
-                <w:sz w:val="18"/>
-              </w:rPr>
-              <w:t>/api/users</w:t>
-            </w:r>
-            <w:r>
-              <w:rPr>
-                <w:rFonts w:ascii="Calibri" w:hAnsi="Calibri"/>
-                <w:sz w:val="19"/>
-              </w:rPr>
-              <w:t>), và API Gán quyền theo kho (</w:t>
-            </w:r>
-            <w:r>
-              <w:rPr>
-                <w:rFonts w:ascii="Consolas" w:hAnsi="Consolas"/>
-                <w:color w:val="9C4124"/>
-                <w:sz w:val="18"/>
-              </w:rPr>
-              <w:t>POST /api/users/{id}/roles</w:t>
-            </w:r>
-            <w:r>
-              <w:rPr>
-                <w:rFonts w:ascii="Calibri" w:hAnsi="Calibri"/>
-                <w:sz w:val="19"/>
-              </w:rPr>
-              <w:t>).</w:t>
-            </w:r>
-          </w:p>
-          <w:p>
-            <w:pPr>
-              <w:spacing w:before="20" w:after="40" w:line="276" w:lineRule="auto"/>
-            </w:pPr>
-            <w:r>
-              <w:rPr>
-                <w:rFonts w:ascii="Calibri" w:hAnsi="Calibri"/>
-                <w:b/>
-                <w:sz w:val="19"/>
-              </w:rPr>
-              <w:t>Tuần 3:</w:t>
-            </w:r>
-            <w:r>
-              <w:rPr>
-                <w:rFonts w:ascii="Calibri" w:hAnsi="Calibri"/>
-                <w:sz w:val="19"/>
-              </w:rPr>
-              <w:t xml:space="preserve"> Phát triển toàn bộ phân hệ Nhập hàng &amp; Cất hàng (</w:t>
-            </w:r>
-            <w:r>
-              <w:rPr>
-                <w:rFonts w:ascii="Consolas" w:hAnsi="Consolas"/>
-                <w:color w:val="9C4124"/>
-                <w:sz w:val="18"/>
-              </w:rPr>
-              <w:t>Inbound / Putaway</w:t>
-            </w:r>
-            <w:r>
-              <w:rPr>
-                <w:rFonts w:ascii="Calibri" w:hAnsi="Calibri"/>
-                <w:sz w:val="19"/>
-              </w:rPr>
-              <w:t xml:space="preserve">: </w:t>
-            </w:r>
-            <w:r>
-              <w:rPr>
-                <w:rFonts w:ascii="Consolas" w:hAnsi="Consolas"/>
-                <w:color w:val="9C4124"/>
-                <w:sz w:val="18"/>
-              </w:rPr>
-              <w:t>/api/receipts</w:t>
-            </w:r>
-            <w:r>
-              <w:rPr>
-                <w:rFonts w:ascii="Calibri" w:hAnsi="Calibri"/>
-                <w:sz w:val="19"/>
-              </w:rPr>
-              <w:t xml:space="preserve">) bao gồm: Tạo phiếu nhập (Supervisor assign Receiver), Xác nhận nhận hàng và cất hàng vào kệ (Receiver). Xử lý chặt chẽ Transaction liên kết </w:t>
-            </w:r>
-            <w:r>
-              <w:rPr>
-                <w:rFonts w:ascii="Consolas" w:hAnsi="Consolas"/>
-                <w:color w:val="9C4124"/>
-                <w:sz w:val="18"/>
-              </w:rPr>
-              <w:t>receipt_lines</w:t>
-            </w:r>
-            <w:r>
-              <w:rPr>
-                <w:rFonts w:ascii="Calibri" w:hAnsi="Calibri"/>
-                <w:sz w:val="19"/>
-              </w:rPr>
-              <w:t xml:space="preserve">, </w:t>
-            </w:r>
-            <w:r>
-              <w:rPr>
-                <w:rFonts w:ascii="Consolas" w:hAnsi="Consolas"/>
-                <w:color w:val="9C4124"/>
-                <w:sz w:val="18"/>
-              </w:rPr>
-              <w:t>inventory</w:t>
-            </w:r>
-            <w:r>
-              <w:rPr>
-                <w:rFonts w:ascii="Calibri" w:hAnsi="Calibri"/>
-                <w:sz w:val="19"/>
-              </w:rPr>
-              <w:t xml:space="preserve">, </w:t>
-            </w:r>
-            <w:r>
-              <w:rPr>
-                <w:rFonts w:ascii="Consolas" w:hAnsi="Consolas"/>
-                <w:color w:val="9C4124"/>
-                <w:sz w:val="18"/>
-              </w:rPr>
-              <w:t>stock_ledger</w:t>
-            </w:r>
-            <w:r>
-              <w:rPr>
-                <w:rFonts w:ascii="Calibri" w:hAnsi="Calibri"/>
-                <w:sz w:val="19"/>
-              </w:rPr>
-              <w:t xml:space="preserve"> và cập nhật thông tin Lô/Hạn sử dụng.</w:t>
+              <w:t>admin</w:t>
+            </w:r>
+            <w:r>
+              <w:rPr>
+                <w:rFonts w:ascii="Calibri" w:hAnsi="Calibri"/>
+                <w:sz w:val="19"/>
+              </w:rPr>
+              <w:t>, danh sách Roles chuẩn và kho mẫu.</w:t>
             </w:r>
           </w:p>
           <w:p>
@@ -3041,7 +3146,7 @@
                 <w:rFonts w:ascii="Calibri" w:hAnsi="Calibri"/>
                 <w:sz w:val="19"/>
               </w:rPr>
-              <w:t>• Phát triển API đề xuất Điều chỉnh tồn kho (</w:t>
+              <w:t xml:space="preserve">• Trực tiếp xây dựng </w:t>
             </w:r>
             <w:r>
               <w:rPr>
@@ -3049,14 +3154,87 @@
                 <w:color w:val="9C4124"/>
                 <w:sz w:val="18"/>
               </w:rPr>
-              <w:t>/api/adjustments</w:t>
-            </w:r>
-            <w:r>
-              <w:rPr>
-                <w:rFonts w:ascii="Calibri" w:hAnsi="Calibri"/>
-                <w:sz w:val="19"/>
-              </w:rPr>
-              <w:t>) và API duyệt điều chỉnh.</w:t>
+              <w:t>InventoryLedgerService</w:t>
+            </w:r>
+            <w:r>
+              <w:rPr>
+                <w:rFonts w:ascii="Calibri" w:hAnsi="Calibri"/>
+                <w:sz w:val="19"/>
+              </w:rPr>
+              <w:t xml:space="preserve"> (</w:t>
+            </w:r>
+            <w:r>
+              <w:rPr>
+                <w:rFonts w:ascii="Consolas" w:hAnsi="Consolas"/>
+                <w:color w:val="9C4124"/>
+                <w:sz w:val="18"/>
+              </w:rPr>
+              <w:t>StockLedgerService</w:t>
+            </w:r>
+            <w:r>
+              <w:rPr>
+                <w:rFonts w:ascii="Calibri" w:hAnsi="Calibri"/>
+                <w:sz w:val="19"/>
+              </w:rPr>
+              <w:t xml:space="preserve">) xử lý mọi biến động tồn kho qua Transaction, Append-only (cấm UPDATE/DELETE </w:t>
+            </w:r>
+            <w:r>
+              <w:rPr>
+                <w:rFonts w:ascii="Consolas" w:hAnsi="Consolas"/>
+                <w:color w:val="9C4124"/>
+                <w:sz w:val="18"/>
+              </w:rPr>
+              <w:t>stock_ledger</w:t>
+            </w:r>
+            <w:r>
+              <w:rPr>
+                <w:rFonts w:ascii="Calibri" w:hAnsi="Calibri"/>
+                <w:sz w:val="19"/>
+              </w:rPr>
+              <w:t>), và cơ chế Lock chống chạy trùng (Concurrency).</w:t>
+            </w:r>
+          </w:p>
+          <w:p>
+            <w:pPr>
+              <w:spacing w:before="20" w:after="40" w:line="276" w:lineRule="auto"/>
+              <w:ind w:left="216"/>
+            </w:pPr>
+            <w:r>
+              <w:rPr>
+                <w:rFonts w:ascii="Calibri" w:hAnsi="Calibri"/>
+                <w:sz w:val="19"/>
+              </w:rPr>
+              <w:t xml:space="preserve">• Xây dựng API tra cứu tồn kho </w:t>
+            </w:r>
+            <w:r>
+              <w:rPr>
+                <w:rFonts w:ascii="Consolas" w:hAnsi="Consolas"/>
+                <w:color w:val="9C4124"/>
+                <w:sz w:val="18"/>
+              </w:rPr>
+              <w:t>/api/inventory</w:t>
+            </w:r>
+            <w:r>
+              <w:rPr>
+                <w:rFonts w:ascii="Calibri" w:hAnsi="Calibri"/>
+                <w:sz w:val="19"/>
+              </w:rPr>
+              <w:t xml:space="preserve"> và lịch sử thẻ kho </w:t>
+            </w:r>
+            <w:r>
+              <w:rPr>
+                <w:rFonts w:ascii="Consolas" w:hAnsi="Consolas"/>
+                <w:color w:val="9C4124"/>
+                <w:sz w:val="18"/>
+              </w:rPr>
+              <w:t>/api/stock-ledger</w:t>
+            </w:r>
+            <w:r>
+              <w:rPr>
+                <w:rFonts w:ascii="Calibri" w:hAnsi="Calibri"/>
+                <w:sz w:val="19"/>
+              </w:rPr>
+              <w:t>.</w:t>
             </w:r>
           </w:p>
           <w:p>
@@ -3069,14 +3247,14 @@
                 <w:b/>
                 <w:sz w:val="19"/>
               </w:rPr>
-              <w:t>Tuần 4 :</w:t>
-            </w:r>
-            <w:r>
-              <w:rPr>
-                <w:rFonts w:ascii="Calibri" w:hAnsi="Calibri"/>
-                <w:sz w:val="19"/>
-              </w:rPr>
-              <w:t xml:space="preserve"> Xây dựng nền tảng luồng Xuất kho (</w:t>
+              <w:t>Tuần 3:</w:t>
+            </w:r>
+            <w:r>
+              <w:rPr>
+                <w:rFonts w:ascii="Calibri" w:hAnsi="Calibri"/>
+                <w:sz w:val="19"/>
+              </w:rPr>
+              <w:t xml:space="preserve"> Xây dựng API Phân hệ Kiểm kê (</w:t>
             </w:r>
             <w:r>
               <w:rPr>
@@ -3084,7 +3262,7 @@
                 <w:color w:val="9C4124"/>
                 <w:sz w:val="18"/>
               </w:rPr>
-              <w:t>Shipment</w:t>
+              <w:t>Cycle Count</w:t>
             </w:r>
             <w:r>
               <w:rPr>
@@ -3099,14 +3277,27 @@
                 <w:color w:val="9C4124"/>
                 <w:sz w:val="18"/>
               </w:rPr>
-              <w:t>/api/shipments</w:t>
-            </w:r>
-            <w:r>
-              <w:rPr>
-                <w:rFonts w:ascii="Calibri" w:hAnsi="Calibri"/>
-                <w:sz w:val="19"/>
-              </w:rPr>
-              <w:t>), thuật toán Gợi ý FEFO (</w:t>
+              <w:t>/api/cycle-counts</w:t>
+            </w:r>
+            <w:r>
+              <w:rPr>
+                <w:rFonts w:ascii="Calibri" w:hAnsi="Calibri"/>
+                <w:sz w:val="19"/>
+              </w:rPr>
+              <w:t>) gồm tạo đợt kiểm kê theo vị trí/kho và nộp kết quả đếm thực tế.</w:t>
+            </w:r>
+          </w:p>
+          <w:p>
+            <w:pPr>
+              <w:spacing w:before="20" w:after="40" w:line="276" w:lineRule="auto"/>
+              <w:ind w:left="216"/>
+            </w:pPr>
+            <w:r>
+              <w:rPr>
+                <w:rFonts w:ascii="Calibri" w:hAnsi="Calibri"/>
+                <w:sz w:val="19"/>
+              </w:rPr>
+              <w:t>• Xây dựng API truy xuất thông tin in Mã QR hàng hóa (</w:t>
             </w:r>
             <w:r>
               <w:rPr>
@@ -3114,14 +3305,34 @@
                 <w:color w:val="9C4124"/>
                 <w:sz w:val="18"/>
               </w:rPr>
-              <w:t>/api/shipments/{id}/fefo-suggestions</w:t>
-            </w:r>
-            <w:r>
-              <w:rPr>
-                <w:rFonts w:ascii="Calibri" w:hAnsi="Calibri"/>
-                <w:sz w:val="19"/>
-              </w:rPr>
-              <w:t xml:space="preserve">), API Khóa tồn kho (Reserve) và Soạn hàng sang khu </w:t>
+              <w:t>/api/qrcodes/sku/.../uom/...</w:t>
+            </w:r>
+            <w:r>
+              <w:rPr>
+                <w:rFonts w:ascii="Calibri" w:hAnsi="Calibri"/>
+                <w:sz w:val="19"/>
+              </w:rPr>
+              <w:t>).</w:t>
+            </w:r>
+          </w:p>
+          <w:p>
+            <w:pPr>
+              <w:spacing w:before="20" w:after="40" w:line="276" w:lineRule="auto"/>
+            </w:pPr>
+            <w:r>
+              <w:rPr>
+                <w:rFonts w:ascii="Calibri" w:hAnsi="Calibri"/>
+                <w:b/>
+                <w:sz w:val="19"/>
+              </w:rPr>
+              <w:t>Tuần 4:</w:t>
+            </w:r>
+            <w:r>
+              <w:rPr>
+                <w:rFonts w:ascii="Calibri" w:hAnsi="Calibri"/>
+                <w:sz w:val="19"/>
+              </w:rPr>
+              <w:t xml:space="preserve"> Thiết kế cấu trúc CSDL và viết API Chuyển kho liên trạm (</w:t>
             </w:r>
             <w:r>
               <w:rPr>
@@ -3129,14 +3340,29 @@
                 <w:color w:val="9C4124"/>
                 <w:sz w:val="18"/>
               </w:rPr>
-              <w:t>STAGING</w:t>
-            </w:r>
-            <w:r>
-              <w:rPr>
-                <w:rFonts w:ascii="Calibri" w:hAnsi="Calibri"/>
-                <w:sz w:val="19"/>
-              </w:rPr>
-              <w:t xml:space="preserve"> (Pick).</w:t>
+              <w:t>/api/transfers</w:t>
+            </w:r>
+            <w:r>
+              <w:rPr>
+                <w:rFonts w:ascii="Calibri" w:hAnsi="Calibri"/>
+                <w:sz w:val="19"/>
+              </w:rPr>
+              <w:t xml:space="preserve">) qua kho trung gian ảo </w:t>
+            </w:r>
+            <w:r>
+              <w:rPr>
+                <w:rFonts w:ascii="Consolas" w:hAnsi="Consolas"/>
+                <w:color w:val="9C4124"/>
+                <w:sz w:val="18"/>
+              </w:rPr>
+              <w:t>TRANSIT</w:t>
+            </w:r>
+            <w:r>
+              <w:rPr>
+                <w:rFonts w:ascii="Calibri" w:hAnsi="Calibri"/>
+                <w:sz w:val="19"/>
+              </w:rPr>
+              <w:t>.</w:t>
             </w:r>
           </w:p>
         </w:tc>
@@ -3166,7 +3392,7 @@
                 <w:b/>
                 <w:sz w:val="19"/>
               </w:rPr>
-              <w:t>Trung Pham</w:t>
+              <w:t>Nam Nguyen</w:t>
             </w:r>
           </w:p>
         </w:tc>
@@ -3191,7 +3417,7 @@
                 <w:b/>
                 <w:sz w:val="19"/>
               </w:rPr>
-              <w:t>Master Data Kho &amp; Hàng hóa, Quản lý Nhà cung cấp, Bút toán đảo &amp; Điều chỉnh nhanh</w:t>
+              <w:t>Xác thực &amp; Người dùng, Nhập kho Inbound &amp; Putaway, Xuất kho (nền móng)</w:t>
             </w:r>
           </w:p>
         </w:tc>
@@ -3223,7 +3449,7 @@
                 <w:rFonts w:ascii="Calibri" w:hAnsi="Calibri"/>
                 <w:sz w:val="19"/>
               </w:rPr>
-              <w:t xml:space="preserve"> Phát triển toàn bộ API Quản lý Kho hàng (</w:t>
+              <w:t xml:space="preserve"> Xây dựng toàn bộ phân hệ Xác thực: API Login (</w:t>
             </w:r>
             <w:r>
               <w:rPr>
@@ -3231,14 +3457,14 @@
                 <w:color w:val="9C4124"/>
                 <w:sz w:val="18"/>
               </w:rPr>
-              <w:t>/api/warehouses</w:t>
-            </w:r>
-            <w:r>
-              <w:rPr>
-                <w:rFonts w:ascii="Calibri" w:hAnsi="Calibri"/>
-                <w:sz w:val="19"/>
-              </w:rPr>
-              <w:t>), API Cây vị trí kho (</w:t>
+              <w:t>POST /api/auth/login</w:t>
+            </w:r>
+            <w:r>
+              <w:rPr>
+                <w:rFonts w:ascii="Calibri" w:hAnsi="Calibri"/>
+                <w:sz w:val="19"/>
+              </w:rPr>
+              <w:t>), Lấy thông tin cá nhân (</w:t>
             </w:r>
             <w:r>
               <w:rPr>
@@ -3246,14 +3472,14 @@
                 <w:color w:val="9C4124"/>
                 <w:sz w:val="18"/>
               </w:rPr>
-              <w:t>/api/locations</w:t>
-            </w:r>
-            <w:r>
-              <w:rPr>
-                <w:rFonts w:ascii="Calibri" w:hAnsi="Calibri"/>
-                <w:sz w:val="19"/>
-              </w:rPr>
-              <w:t>), API Đơn vị tính (</w:t>
+              <w:t>GET /api/auth/me</w:t>
+            </w:r>
+            <w:r>
+              <w:rPr>
+                <w:rFonts w:ascii="Calibri" w:hAnsi="Calibri"/>
+                <w:sz w:val="19"/>
+              </w:rPr>
+              <w:t>), CRUD Người dùng (</w:t>
             </w:r>
             <w:r>
               <w:rPr>
@@ -3261,14 +3487,14 @@
                 <w:color w:val="9C4124"/>
                 <w:sz w:val="18"/>
               </w:rPr>
-              <w:t>/api/uoms</w:t>
-            </w:r>
-            <w:r>
-              <w:rPr>
-                <w:rFonts w:ascii="Calibri" w:hAnsi="Calibri"/>
-                <w:sz w:val="19"/>
-              </w:rPr>
-              <w:t>), và API Danh mục Sản phẩm (</w:t>
+              <w:t>/api/users</w:t>
+            </w:r>
+            <w:r>
+              <w:rPr>
+                <w:rFonts w:ascii="Calibri" w:hAnsi="Calibri"/>
+                <w:sz w:val="19"/>
+              </w:rPr>
+              <w:t>), và API Gán quyền theo kho (</w:t>
             </w:r>
             <w:r>
               <w:rPr>
@@ -3276,14 +3502,14 @@
                 <w:color w:val="9C4124"/>
                 <w:sz w:val="18"/>
               </w:rPr>
-              <w:t>/api/skus</w:t>
-            </w:r>
-            <w:r>
-              <w:rPr>
-                <w:rFonts w:ascii="Calibri" w:hAnsi="Calibri"/>
-                <w:sz w:val="19"/>
-              </w:rPr>
-              <w:t xml:space="preserve"> &amp; quy đổi đơn vị tính).</w:t>
+              <w:t>POST /api/users/{id}/roles</w:t>
+            </w:r>
+            <w:r>
+              <w:rPr>
+                <w:rFonts w:ascii="Calibri" w:hAnsi="Calibri"/>
+                <w:sz w:val="19"/>
+              </w:rPr>
+              <w:t>).</w:t>
             </w:r>
           </w:p>
           <w:p>
@@ -3303,7 +3529,7 @@
                 <w:rFonts w:ascii="Calibri" w:hAnsi="Calibri"/>
                 <w:sz w:val="19"/>
               </w:rPr>
-              <w:t xml:space="preserve"> Xây dựng toàn bộ phân hệ Quản lý Nhà cung cấp &amp; Đối tác (</w:t>
+              <w:t xml:space="preserve"> Phát triển toàn bộ phân hệ Nhập hàng &amp; Cất hàng (</w:t>
             </w:r>
             <w:r>
               <w:rPr>
@@ -3311,14 +3537,14 @@
                 <w:color w:val="9C4124"/>
                 <w:sz w:val="18"/>
               </w:rPr>
-              <w:t>/api/suppliers</w:t>
-            </w:r>
-            <w:r>
-              <w:rPr>
-                <w:rFonts w:ascii="Calibri" w:hAnsi="Calibri"/>
-                <w:sz w:val="19"/>
-              </w:rPr>
-              <w:t>): Thêm, sửa, xóa, tìm kiếm nhà cung cấp; API gán mã SKU của nhà cung cấp (</w:t>
+              <w:t>Inbound / Putaway</w:t>
+            </w:r>
+            <w:r>
+              <w:rPr>
+                <w:rFonts w:ascii="Calibri" w:hAnsi="Calibri"/>
+                <w:sz w:val="19"/>
+              </w:rPr>
+              <w:t xml:space="preserve">: </w:t>
             </w:r>
             <w:r>
               <w:rPr>
@@ -3326,14 +3552,87 @@
                 <w:color w:val="9C4124"/>
                 <w:sz w:val="18"/>
               </w:rPr>
-              <w:t>/api/suppliers/{id}/skus</w:t>
-            </w:r>
-            <w:r>
-              <w:rPr>
-                <w:rFonts w:ascii="Calibri" w:hAnsi="Calibri"/>
-                <w:sz w:val="19"/>
-              </w:rPr>
-              <w:t>).</w:t>
+              <w:t>/api/receipts</w:t>
+            </w:r>
+            <w:r>
+              <w:rPr>
+                <w:rFonts w:ascii="Calibri" w:hAnsi="Calibri"/>
+                <w:sz w:val="19"/>
+              </w:rPr>
+              <w:t xml:space="preserve">) bao gồm: Tạo phiếu nhập (Supervisor assign Receiver), Xác nhận nhận hàng và cất hàng vào kệ (Receiver). Xử lý chặt chẽ Transaction liên kết </w:t>
+            </w:r>
+            <w:r>
+              <w:rPr>
+                <w:rFonts w:ascii="Consolas" w:hAnsi="Consolas"/>
+                <w:color w:val="9C4124"/>
+                <w:sz w:val="18"/>
+              </w:rPr>
+              <w:t>receipt_lines</w:t>
+            </w:r>
+            <w:r>
+              <w:rPr>
+                <w:rFonts w:ascii="Calibri" w:hAnsi="Calibri"/>
+                <w:sz w:val="19"/>
+              </w:rPr>
+              <w:t xml:space="preserve">, </w:t>
+            </w:r>
+            <w:r>
+              <w:rPr>
+                <w:rFonts w:ascii="Consolas" w:hAnsi="Consolas"/>
+                <w:color w:val="9C4124"/>
+                <w:sz w:val="18"/>
+              </w:rPr>
+              <w:t>inventory</w:t>
+            </w:r>
+            <w:r>
+              <w:rPr>
+                <w:rFonts w:ascii="Calibri" w:hAnsi="Calibri"/>
+                <w:sz w:val="19"/>
+              </w:rPr>
+              <w:t xml:space="preserve">, </w:t>
+            </w:r>
+            <w:r>
+              <w:rPr>
+                <w:rFonts w:ascii="Consolas" w:hAnsi="Consolas"/>
+                <w:color w:val="9C4124"/>
+                <w:sz w:val="18"/>
+              </w:rPr>
+              <w:t>stock_ledger</w:t>
+            </w:r>
+            <w:r>
+              <w:rPr>
+                <w:rFonts w:ascii="Calibri" w:hAnsi="Calibri"/>
+                <w:sz w:val="19"/>
+              </w:rPr>
+              <w:t xml:space="preserve"> và cập nhật thông tin Lô/Hạn sử dụng.</w:t>
+            </w:r>
+          </w:p>
+          <w:p>
+            <w:pPr>
+              <w:spacing w:before="20" w:after="40" w:line="276" w:lineRule="auto"/>
+              <w:ind w:left="216"/>
+            </w:pPr>
+            <w:r>
+              <w:rPr>
+                <w:rFonts w:ascii="Calibri" w:hAnsi="Calibri"/>
+                <w:sz w:val="19"/>
+              </w:rPr>
+              <w:t>• Phát triển API đề xuất Điều chỉnh tồn kho (</w:t>
+            </w:r>
+            <w:r>
+              <w:rPr>
+                <w:rFonts w:ascii="Consolas" w:hAnsi="Consolas"/>
+                <w:color w:val="9C4124"/>
+                <w:sz w:val="18"/>
+              </w:rPr>
+              <w:t>/api/adjustments</w:t>
+            </w:r>
+            <w:r>
+              <w:rPr>
+                <w:rFonts w:ascii="Calibri" w:hAnsi="Calibri"/>
+                <w:sz w:val="19"/>
+              </w:rPr>
+              <w:t>) và API duyệt điều chỉnh.</w:t>
             </w:r>
           </w:p>
           <w:p>
@@ -3346,14 +3645,14 @@
                 <w:b/>
                 <w:sz w:val="19"/>
               </w:rPr>
-              <w:t>Tuần 4 :</w:t>
-            </w:r>
-            <w:r>
-              <w:rPr>
-                <w:rFonts w:ascii="Calibri" w:hAnsi="Calibri"/>
-                <w:sz w:val="19"/>
-              </w:rPr>
-              <w:t xml:space="preserve"> Phát triển phân hệ Bút toán đảo (</w:t>
+              <w:t>Tuần 4:</w:t>
+            </w:r>
+            <w:r>
+              <w:rPr>
+                <w:rFonts w:ascii="Calibri" w:hAnsi="Calibri"/>
+                <w:sz w:val="19"/>
+              </w:rPr>
+              <w:t xml:space="preserve"> Xây dựng nền tảng luồng Xuất kho (</w:t>
             </w:r>
             <w:r>
               <w:rPr>
@@ -3361,7 +3660,7 @@
                 <w:color w:val="9C4124"/>
                 <w:sz w:val="18"/>
               </w:rPr>
-              <w:t>Reversal</w:t>
+              <w:t>Shipment</w:t>
             </w:r>
             <w:r>
               <w:rPr>
@@ -3376,14 +3675,14 @@
                 <w:color w:val="9C4124"/>
                 <w:sz w:val="18"/>
               </w:rPr>
-              <w:t>/api/reversals/requests</w:t>
-            </w:r>
-            <w:r>
-              <w:rPr>
-                <w:rFonts w:ascii="Calibri" w:hAnsi="Calibri"/>
-                <w:sz w:val="19"/>
-              </w:rPr>
-              <w:t>) gồm tạo yêu cầu đảo từ dòng thẻ kho sai và luồng trình Admin duyệt. Xây dựng API Điều chỉnh nhanh (</w:t>
+              <w:t>/api/shipments</w:t>
+            </w:r>
+            <w:r>
+              <w:rPr>
+                <w:rFonts w:ascii="Calibri" w:hAnsi="Calibri"/>
+                <w:sz w:val="19"/>
+              </w:rPr>
+              <w:t>), thuật toán Gợi ý FEFO (</w:t>
             </w:r>
             <w:r>
               <w:rPr>
@@ -3391,14 +3690,14 @@
                 <w:color w:val="9C4124"/>
                 <w:sz w:val="18"/>
               </w:rPr>
-              <w:t>Quick Adjustment</w:t>
-            </w:r>
-            <w:r>
-              <w:rPr>
-                <w:rFonts w:ascii="Calibri" w:hAnsi="Calibri"/>
-                <w:sz w:val="19"/>
-              </w:rPr>
-              <w:t xml:space="preserve">) từ UI tồn kho với cơ chế </w:t>
+              <w:t>/api/shipments/{id}/fefo-suggestions</w:t>
+            </w:r>
+            <w:r>
+              <w:rPr>
+                <w:rFonts w:ascii="Calibri" w:hAnsi="Calibri"/>
+                <w:sz w:val="19"/>
+              </w:rPr>
+              <w:t xml:space="preserve">), API Khóa tồn kho (Reserve) và Soạn hàng sang khu </w:t>
             </w:r>
             <w:r>
               <w:rPr>
@@ -3406,14 +3705,14 @@
                 <w:color w:val="9C4124"/>
                 <w:sz w:val="18"/>
               </w:rPr>
-              <w:t>inventoryVersion</w:t>
-            </w:r>
-            <w:r>
-              <w:rPr>
-                <w:rFonts w:ascii="Calibri" w:hAnsi="Calibri"/>
-                <w:sz w:val="19"/>
-              </w:rPr>
-              <w:t xml:space="preserve"> kiểm soát xung đột (Optimistic Lock chặn 409).</w:t>
+              <w:t>STAGING</w:t>
+            </w:r>
+            <w:r>
+              <w:rPr>
+                <w:rFonts w:ascii="Calibri" w:hAnsi="Calibri"/>
+                <w:sz w:val="19"/>
+              </w:rPr>
+              <w:t xml:space="preserve"> (Pick).</w:t>
             </w:r>
           </w:p>
         </w:tc>
@@ -3468,7 +3767,7 @@
                 <w:b/>
                 <w:sz w:val="19"/>
               </w:rPr>
-              <w:t>Frontend UI/UX (Toàn bộ Giao diện Vận hành &amp; Quản trị)</w:t>
+              <w:t>Frontend UI/UX (Toàn bộ Giao diện Vận hành &amp; Quản trị)</w:t>
             </w:r>
           </w:p>
         </w:tc>
@@ -4058,7 +4357,7 @@
                 <w:b/>
                 <w:sz w:val="19"/>
               </w:rPr>
-              <w:t>Nam Nguyen</w:t>
+              <w:t>Trung Pham</w:t>
             </w:r>
           </w:p>
         </w:tc>
@@ -4083,7 +4382,7 @@
                 <w:b/>
                 <w:sz w:val="19"/>
               </w:rPr>
-              <w:t>Hoàn thiện Xuất kho Dispatch, Module Hàng hoàn trả (Returns / RMA) &amp; Tự động sinh Barcode</w:t>
+              <w:t>Team Leader (Điều phối, Rà soát, Kiểm thử E2E) &amp; Bút toán đảo, Bảo mật/RBAC, Dashboard 5 Role</w:t>
             </w:r>
           </w:p>
         </w:tc>
@@ -4108,124 +4407,7 @@
                 <w:b/>
                 <w:sz w:val="19"/>
               </w:rPr>
-              <w:t>Tiếp tục Tuần 4:</w:t>
-            </w:r>
-            <w:r>
-              <w:rPr>
-                <w:rFonts w:ascii="Calibri" w:hAnsi="Calibri"/>
-                <w:sz w:val="19"/>
-              </w:rPr>
-              <w:t xml:space="preserve"> Hoàn thiện API Xuất kho - Dispatch (</w:t>
-            </w:r>
-            <w:r>
-              <w:rPr>
-                <w:rFonts w:ascii="Consolas" w:hAnsi="Consolas"/>
-                <w:color w:val="9C4124"/>
-                <w:sz w:val="18"/>
-              </w:rPr>
-              <w:t>POST /api/shipments/{id}/dispatch</w:t>
-            </w:r>
-            <w:r>
-              <w:rPr>
-                <w:rFonts w:ascii="Calibri" w:hAnsi="Calibri"/>
-                <w:sz w:val="19"/>
-              </w:rPr>
-              <w:t xml:space="preserve">): Lưu vết </w:t>
-            </w:r>
-            <w:r>
-              <w:rPr>
-                <w:rFonts w:ascii="Consolas" w:hAnsi="Consolas"/>
-                <w:color w:val="9C4124"/>
-                <w:sz w:val="18"/>
-              </w:rPr>
-              <w:t>shipment_dispatch_lines</w:t>
-            </w:r>
-            <w:r>
-              <w:rPr>
-                <w:rFonts w:ascii="Calibri" w:hAnsi="Calibri"/>
-                <w:sz w:val="19"/>
-              </w:rPr>
-              <w:t xml:space="preserve">, cơ chế chống spam click bằng </w:t>
-            </w:r>
-            <w:r>
-              <w:rPr>
-                <w:rFonts w:ascii="Consolas" w:hAnsi="Consolas"/>
-                <w:color w:val="9C4124"/>
-                <w:sz w:val="18"/>
-              </w:rPr>
-              <w:t>requestId</w:t>
-            </w:r>
-            <w:r>
-              <w:rPr>
-                <w:rFonts w:ascii="Calibri" w:hAnsi="Calibri"/>
-                <w:sz w:val="19"/>
-              </w:rPr>
-              <w:t xml:space="preserve"> (Idempotency), xử lý chuyển trạng thái </w:t>
-            </w:r>
-            <w:r>
-              <w:rPr>
-                <w:rFonts w:ascii="Consolas" w:hAnsi="Consolas"/>
-                <w:color w:val="9C4124"/>
-                <w:sz w:val="18"/>
-              </w:rPr>
-              <w:t>PARTIALLY_SHIPPED</w:t>
-            </w:r>
-            <w:r>
-              <w:rPr>
-                <w:rFonts w:ascii="Calibri" w:hAnsi="Calibri"/>
-                <w:sz w:val="19"/>
-              </w:rPr>
-              <w:t xml:space="preserve"> khi giao thiếu.</w:t>
-            </w:r>
-          </w:p>
-          <w:p>
-            <w:pPr>
-              <w:spacing w:before="20" w:after="40" w:line="276" w:lineRule="auto"/>
-            </w:pPr>
-            <w:r>
-              <w:rPr>
-                <w:rFonts w:ascii="Calibri" w:hAnsi="Calibri"/>
-                <w:b/>
-                <w:sz w:val="19"/>
-              </w:rPr>
-              <w:t>Tuần 5 (Module Returns):</w:t>
-            </w:r>
-            <w:r>
-              <w:rPr>
-                <w:rFonts w:ascii="Calibri" w:hAnsi="Calibri"/>
-                <w:sz w:val="19"/>
-              </w:rPr>
-              <w:t xml:space="preserve"> Tạo các model Prisma </w:t>
-            </w:r>
-            <w:r>
-              <w:rPr>
-                <w:rFonts w:ascii="Consolas" w:hAnsi="Consolas"/>
-                <w:color w:val="9C4124"/>
-                <w:sz w:val="18"/>
-              </w:rPr>
-              <w:t>ReturnOrder</w:t>
-            </w:r>
-            <w:r>
-              <w:rPr>
-                <w:rFonts w:ascii="Calibri" w:hAnsi="Calibri"/>
-                <w:sz w:val="19"/>
-              </w:rPr>
-              <w:t xml:space="preserve">, </w:t>
-            </w:r>
-            <w:r>
-              <w:rPr>
-                <w:rFonts w:ascii="Consolas" w:hAnsi="Consolas"/>
-                <w:color w:val="9C4124"/>
-                <w:sz w:val="18"/>
-              </w:rPr>
-              <w:t>ReturnLine</w:t>
-            </w:r>
-            <w:r>
-              <w:rPr>
-                <w:rFonts w:ascii="Calibri" w:hAnsi="Calibri"/>
-                <w:sz w:val="19"/>
-              </w:rPr>
-              <w:t>. Viết trọn bộ API Hàng hoàn trả:</w:t>
+              <w:t>Nhiệm vụ Leader:</w:t>
             </w:r>
           </w:p>
           <w:p>
@@ -4238,7 +4420,7 @@
                 <w:rFonts w:ascii="Calibri" w:hAnsi="Calibri"/>
                 <w:sz w:val="19"/>
               </w:rPr>
-              <w:t>• Tạo phiếu hoàn trả từ đơn xuất gốc (</w:t>
+              <w:t>• Thu thập ý kiến phản hồi sau buổi Demo; rà soát các vấn đề phát sinh để xây dựng kế hoạch nâng cấp và tối ưu Tuần 5 (</w:t>
             </w:r>
             <w:r>
               <w:rPr>
@@ -4246,7 +4428,7 @@
                 <w:color w:val="9C4124"/>
                 <w:sz w:val="18"/>
               </w:rPr>
-              <w:t>POST /api/returns</w:t>
+              <w:t>plan_week5.md</w:t>
             </w:r>
             <w:r>
               <w:rPr>
@@ -4266,22 +4448,7 @@
                 <w:rFonts w:ascii="Calibri" w:hAnsi="Calibri"/>
                 <w:sz w:val="19"/>
               </w:rPr>
-              <w:t>• Phân công nhân viên nhận hàng (</w:t>
-            </w:r>
-            <w:r>
-              <w:rPr>
-                <w:rFonts w:ascii="Consolas" w:hAnsi="Consolas"/>
-                <w:color w:val="9C4124"/>
-                <w:sz w:val="18"/>
-              </w:rPr>
-              <w:t>POST /api/returns/{id}/assign</w:t>
-            </w:r>
-            <w:r>
-              <w:rPr>
-                <w:rFonts w:ascii="Calibri" w:hAnsi="Calibri"/>
-                <w:sz w:val="19"/>
-              </w:rPr>
-              <w:t>).</w:t>
+              <w:t>• Rà soát nghiệm thu kết quả các feature mới của các thành viên (Nhập kho đa vị trí, Sức chứa phân cấp, Returns RMA, UI Dashboard).</w:t>
             </w:r>
           </w:p>
           <w:p>
@@ -4294,7 +4461,22 @@
                 <w:rFonts w:ascii="Calibri" w:hAnsi="Calibri"/>
                 <w:sz w:val="19"/>
               </w:rPr>
-              <w:t>• Tiếp nhận cân thực tế tại cửa kho vào khu cách ly (</w:t>
+              <w:t xml:space="preserve">• </w:t>
+            </w:r>
+            <w:r>
+              <w:rPr>
+                <w:rFonts w:ascii="Calibri" w:hAnsi="Calibri"/>
+                <w:b/>
+                <w:sz w:val="19"/>
+              </w:rPr>
+              <w:t>Kiểm thử thủ công toàn diện (End-to-End Manual Testing):</w:t>
+            </w:r>
+            <w:r>
+              <w:rPr>
+                <w:rFonts w:ascii="Calibri" w:hAnsi="Calibri"/>
+                <w:sz w:val="19"/>
+              </w:rPr>
+              <w:t xml:space="preserve"> Đóng vai trực tiếp cả 7 Roles (Admin, Manager, Supervisor, Receiver, Picker, Inspector, Viewer) để chạy thông suốt toàn bộ kịch bản thực tế từ Inbound → Outbound Dispatch → Chuyển kho → Kiểm kê → Trả hàng RMA; đối soát dữ liệu sổ cái </w:t>
             </w:r>
             <w:r>
               <w:rPr>
@@ -4302,59 +4484,27 @@
                 <w:color w:val="9C4124"/>
                 <w:sz w:val="18"/>
               </w:rPr>
-              <w:t>POST /api/returns/{id}/receive</w:t>
-            </w:r>
-            <w:r>
-              <w:rPr>
-                <w:rFonts w:ascii="Calibri" w:hAnsi="Calibri"/>
-                <w:sz w:val="19"/>
-              </w:rPr>
-              <w:t xml:space="preserve">): Bắt buộc nhận vào ô có </w:t>
-            </w:r>
-            <w:r>
-              <w:rPr>
-                <w:rFonts w:ascii="Consolas" w:hAnsi="Consolas"/>
-                <w:color w:val="9C4124"/>
-                <w:sz w:val="18"/>
-              </w:rPr>
-              <w:t>purpose = 'QC'</w:t>
-            </w:r>
-            <w:r>
-              <w:rPr>
-                <w:rFonts w:ascii="Calibri" w:hAnsi="Calibri"/>
-                <w:sz w:val="19"/>
-              </w:rPr>
-              <w:t xml:space="preserve"> hoặc </w:t>
-            </w:r>
-            <w:r>
-              <w:rPr>
-                <w:rFonts w:ascii="Consolas" w:hAnsi="Consolas"/>
-                <w:color w:val="9C4124"/>
-                <w:sz w:val="18"/>
-              </w:rPr>
-              <w:t>'DAMAGED'</w:t>
-            </w:r>
-            <w:r>
-              <w:rPr>
-                <w:rFonts w:ascii="Calibri" w:hAnsi="Calibri"/>
-                <w:sz w:val="19"/>
-              </w:rPr>
-              <w:t xml:space="preserve">, ghi sổ cái loại </w:t>
-            </w:r>
-            <w:r>
-              <w:rPr>
-                <w:rFonts w:ascii="Consolas" w:hAnsi="Consolas"/>
-                <w:color w:val="9C4124"/>
-                <w:sz w:val="18"/>
-              </w:rPr>
-              <w:t>RETURN</w:t>
-            </w:r>
-            <w:r>
-              <w:rPr>
-                <w:rFonts w:ascii="Calibri" w:hAnsi="Calibri"/>
-                <w:sz w:val="19"/>
-              </w:rPr>
-              <w:t xml:space="preserve"> cách ly không bán được.</w:t>
+              <w:t>stock_ledger</w:t>
+            </w:r>
+            <w:r>
+              <w:rPr>
+                <w:rFonts w:ascii="Calibri" w:hAnsi="Calibri"/>
+                <w:sz w:val="19"/>
+              </w:rPr>
+              <w:t xml:space="preserve"> đảm bảo hệ thống sẵn sàng 100% cho Demo Tổng kết.</w:t>
+            </w:r>
+          </w:p>
+          <w:p>
+            <w:pPr>
+              <w:spacing w:before="20" w:after="40" w:line="276" w:lineRule="auto"/>
+            </w:pPr>
+            <w:r>
+              <w:rPr>
+                <w:rFonts w:ascii="Calibri" w:hAnsi="Calibri"/>
+                <w:b/>
+                <w:sz w:val="19"/>
+              </w:rPr>
+              <w:t>Nhiệm vụ Backend:</w:t>
             </w:r>
           </w:p>
           <w:p>
@@ -4367,7 +4517,22 @@
                 <w:rFonts w:ascii="Calibri" w:hAnsi="Calibri"/>
                 <w:sz w:val="19"/>
               </w:rPr>
-              <w:t>• Kiểm định chất lượng (</w:t>
+              <w:t xml:space="preserve">• </w:t>
+            </w:r>
+            <w:r>
+              <w:rPr>
+                <w:rFonts w:ascii="Calibri" w:hAnsi="Calibri"/>
+                <w:b/>
+                <w:sz w:val="19"/>
+              </w:rPr>
+              <w:t>Tiếp tục Tuần 4:</w:t>
+            </w:r>
+            <w:r>
+              <w:rPr>
+                <w:rFonts w:ascii="Calibri" w:hAnsi="Calibri"/>
+                <w:sz w:val="19"/>
+              </w:rPr>
+              <w:t xml:space="preserve"> Hoàn thiện API duyệt Bút toán đảo (</w:t>
             </w:r>
             <w:r>
               <w:rPr>
@@ -4375,14 +4540,14 @@
                 <w:color w:val="9C4124"/>
                 <w:sz w:val="18"/>
               </w:rPr>
-              <w:t>POST /api/returns/{id}/inspect</w:t>
-            </w:r>
-            <w:r>
-              <w:rPr>
-                <w:rFonts w:ascii="Calibri" w:hAnsi="Calibri"/>
-                <w:sz w:val="19"/>
-              </w:rPr>
-              <w:t xml:space="preserve">): Xử lý 2 nhánh </w:t>
+              <w:t>/api/reversals/requests/{id}/approve</w:t>
+            </w:r>
+            <w:r>
+              <w:rPr>
+                <w:rFonts w:ascii="Calibri" w:hAnsi="Calibri"/>
+                <w:sz w:val="19"/>
+              </w:rPr>
+              <w:t xml:space="preserve">): Đóng gói thành hàm chuyên biệt </w:t>
             </w:r>
             <w:r>
               <w:rPr>
@@ -4390,14 +4555,14 @@
                 <w:color w:val="9C4124"/>
                 <w:sz w:val="18"/>
               </w:rPr>
-              <w:t>RESTOCK</w:t>
-            </w:r>
-            <w:r>
-              <w:rPr>
-                <w:rFonts w:ascii="Calibri" w:hAnsi="Calibri"/>
-                <w:sz w:val="19"/>
-              </w:rPr>
-              <w:t xml:space="preserve"> (nhập lại ô bán) hoặc </w:t>
+              <w:t>executeReversal(...)</w:t>
+            </w:r>
+            <w:r>
+              <w:rPr>
+                <w:rFonts w:ascii="Calibri" w:hAnsi="Calibri"/>
+                <w:sz w:val="19"/>
+              </w:rPr>
+              <w:t xml:space="preserve"> trong </w:t>
             </w:r>
             <w:r>
               <w:rPr>
@@ -4405,34 +4570,42 @@
                 <w:color w:val="9C4124"/>
                 <w:sz w:val="18"/>
               </w:rPr>
-              <w:t>SCRAP</w:t>
-            </w:r>
-            <w:r>
-              <w:rPr>
-                <w:rFonts w:ascii="Calibri" w:hAnsi="Calibri"/>
-                <w:sz w:val="19"/>
-              </w:rPr>
-              <w:t xml:space="preserve"> (tiêu hủy).</w:t>
+              <w:t>InventoryLedgerService</w:t>
+            </w:r>
+            <w:r>
+              <w:rPr>
+                <w:rFonts w:ascii="Calibri" w:hAnsi="Calibri"/>
+                <w:sz w:val="19"/>
+              </w:rPr>
+              <w:t>, kiểm tra nghiêm ngặt điều kiện 1 vế, chống âm kho.</w:t>
             </w:r>
           </w:p>
           <w:p>
             <w:pPr>
               <w:spacing w:before="20" w:after="40" w:line="276" w:lineRule="auto"/>
+              <w:ind w:left="216"/>
             </w:pPr>
             <w:r>
               <w:rPr>
                 <w:rFonts w:ascii="Calibri" w:hAnsi="Calibri"/>
+                <w:sz w:val="19"/>
+              </w:rPr>
+              <w:t xml:space="preserve">• </w:t>
+            </w:r>
+            <w:r>
+              <w:rPr>
+                <w:rFonts w:ascii="Calibri" w:hAnsi="Calibri"/>
                 <w:b/>
                 <w:sz w:val="19"/>
               </w:rPr>
-              <w:t>Tuần 5 (Barcode):</w:t>
-            </w:r>
-            <w:r>
-              <w:rPr>
-                <w:rFonts w:ascii="Calibri" w:hAnsi="Calibri"/>
-                <w:sz w:val="19"/>
-              </w:rPr>
-              <w:t xml:space="preserve"> Triển khai logic Backend tự động sinh mã vạch chuẩn </w:t>
+              <w:t>Tuần 5 (Security &amp; RBAC):</w:t>
+            </w:r>
+            <w:r>
+              <w:rPr>
+                <w:rFonts w:ascii="Calibri" w:hAnsi="Calibri"/>
+                <w:sz w:val="19"/>
+              </w:rPr>
+              <w:t xml:space="preserve"> Cập nhật enum mã quyền mới (</w:t>
             </w:r>
             <w:r>
               <w:rPr>
@@ -4440,14 +4613,177 @@
                 <w:color w:val="9C4124"/>
                 <w:sz w:val="18"/>
               </w:rPr>
-              <w:t>BAR-{skuCode}-{uomCode}</w:t>
-            </w:r>
-            <w:r>
-              <w:rPr>
-                <w:rFonts w:ascii="Calibri" w:hAnsi="Calibri"/>
-                <w:sz w:val="19"/>
-              </w:rPr>
-              <w:t xml:space="preserve"> khi tạo mới quy đổi đơn vị tính.</w:t>
+              <w:t>RETURN.*</w:t>
+            </w:r>
+            <w:r>
+              <w:rPr>
+                <w:rFonts w:ascii="Calibri" w:hAnsi="Calibri"/>
+                <w:sz w:val="19"/>
+              </w:rPr>
+              <w:t xml:space="preserve">, </w:t>
+            </w:r>
+            <w:r>
+              <w:rPr>
+                <w:rFonts w:ascii="Consolas" w:hAnsi="Consolas"/>
+                <w:color w:val="9C4124"/>
+                <w:sz w:val="18"/>
+              </w:rPr>
+              <w:t>DASHBOARD_READ</w:t>
+            </w:r>
+            <w:r>
+              <w:rPr>
+                <w:rFonts w:ascii="Calibri" w:hAnsi="Calibri"/>
+                <w:sz w:val="19"/>
+              </w:rPr>
+              <w:t xml:space="preserve">, </w:t>
+            </w:r>
+            <w:r>
+              <w:rPr>
+                <w:rFonts w:ascii="Consolas" w:hAnsi="Consolas"/>
+                <w:color w:val="9C4124"/>
+                <w:sz w:val="18"/>
+              </w:rPr>
+              <w:t>USER_RESET_PASSWORD</w:t>
+            </w:r>
+            <w:r>
+              <w:rPr>
+                <w:rFonts w:ascii="Calibri" w:hAnsi="Calibri"/>
+                <w:sz w:val="19"/>
+              </w:rPr>
+              <w:t xml:space="preserve">), cập nhật </w:t>
+            </w:r>
+            <w:r>
+              <w:rPr>
+                <w:rFonts w:ascii="Consolas" w:hAnsi="Consolas"/>
+                <w:color w:val="9C4124"/>
+                <w:sz w:val="18"/>
+              </w:rPr>
+              <w:t>permission-defaults.ts</w:t>
+            </w:r>
+            <w:r>
+              <w:rPr>
+                <w:rFonts w:ascii="Calibri" w:hAnsi="Calibri"/>
+                <w:sz w:val="19"/>
+              </w:rPr>
+              <w:t xml:space="preserve"> và chạy Patch script cập nhật quyền vào CSDL. Viết API Reset Password cho Admin (</w:t>
+            </w:r>
+            <w:r>
+              <w:rPr>
+                <w:rFonts w:ascii="Consolas" w:hAnsi="Consolas"/>
+                <w:color w:val="9C4124"/>
+                <w:sz w:val="18"/>
+              </w:rPr>
+              <w:t>POST /api/users/{id}/reset-password</w:t>
+            </w:r>
+            <w:r>
+              <w:rPr>
+                <w:rFonts w:ascii="Calibri" w:hAnsi="Calibri"/>
+                <w:sz w:val="19"/>
+              </w:rPr>
+              <w:t>).</w:t>
+            </w:r>
+          </w:p>
+          <w:p>
+            <w:pPr>
+              <w:spacing w:before="20" w:after="40" w:line="276" w:lineRule="auto"/>
+              <w:ind w:left="216"/>
+            </w:pPr>
+            <w:r>
+              <w:rPr>
+                <w:rFonts w:ascii="Calibri" w:hAnsi="Calibri"/>
+                <w:sz w:val="19"/>
+              </w:rPr>
+              <w:t xml:space="preserve">• </w:t>
+            </w:r>
+            <w:r>
+              <w:rPr>
+                <w:rFonts w:ascii="Calibri" w:hAnsi="Calibri"/>
+                <w:b/>
+                <w:sz w:val="19"/>
+              </w:rPr>
+              <w:t>Tuần 5 (Cảnh báo &amp; Sơ đồ kho):</w:t>
+            </w:r>
+            <w:r>
+              <w:rPr>
+                <w:rFonts w:ascii="Calibri" w:hAnsi="Calibri"/>
+                <w:sz w:val="19"/>
+              </w:rPr>
+              <w:t xml:space="preserve"> Bổ sung tính toán động </w:t>
+            </w:r>
+            <w:r>
+              <w:rPr>
+                <w:rFonts w:ascii="Consolas" w:hAnsi="Consolas"/>
+                <w:color w:val="9C4124"/>
+                <w:sz w:val="18"/>
+              </w:rPr>
+              <w:t>daysUntilExpiry</w:t>
+            </w:r>
+            <w:r>
+              <w:rPr>
+                <w:rFonts w:ascii="Calibri" w:hAnsi="Calibri"/>
+                <w:sz w:val="19"/>
+              </w:rPr>
+              <w:t xml:space="preserve"> và cờ cảnh báo </w:t>
+            </w:r>
+            <w:r>
+              <w:rPr>
+                <w:rFonts w:ascii="Consolas" w:hAnsi="Consolas"/>
+                <w:color w:val="9C4124"/>
+                <w:sz w:val="18"/>
+              </w:rPr>
+              <w:t>expiryAlert</w:t>
+            </w:r>
+            <w:r>
+              <w:rPr>
+                <w:rFonts w:ascii="Calibri" w:hAnsi="Calibri"/>
+                <w:sz w:val="19"/>
+              </w:rPr>
+              <w:t xml:space="preserve"> (</w:t>
+            </w:r>
+            <w:r>
+              <w:rPr>
+                <w:rFonts w:ascii="Consolas" w:hAnsi="Consolas"/>
+                <w:color w:val="9C4124"/>
+                <w:sz w:val="18"/>
+              </w:rPr>
+              <w:t>CRITICAL</w:t>
+            </w:r>
+            <w:r>
+              <w:rPr>
+                <w:rFonts w:ascii="Calibri" w:hAnsi="Calibri"/>
+                <w:sz w:val="19"/>
+              </w:rPr>
+              <w:t xml:space="preserve">, </w:t>
+            </w:r>
+            <w:r>
+              <w:rPr>
+                <w:rFonts w:ascii="Consolas" w:hAnsi="Consolas"/>
+                <w:color w:val="9C4124"/>
+                <w:sz w:val="18"/>
+              </w:rPr>
+              <w:t>WARNING</w:t>
+            </w:r>
+            <w:r>
+              <w:rPr>
+                <w:rFonts w:ascii="Calibri" w:hAnsi="Calibri"/>
+                <w:sz w:val="19"/>
+              </w:rPr>
+              <w:t xml:space="preserve">, </w:t>
+            </w:r>
+            <w:r>
+              <w:rPr>
+                <w:rFonts w:ascii="Consolas" w:hAnsi="Consolas"/>
+                <w:color w:val="9C4124"/>
+                <w:sz w:val="18"/>
+              </w:rPr>
+              <w:t>NORMAL</w:t>
+            </w:r>
+            <w:r>
+              <w:rPr>
+                <w:rFonts w:ascii="Calibri" w:hAnsi="Calibri"/>
+                <w:sz w:val="19"/>
+              </w:rPr>
+              <w:t>) trong API Tồn kho. Nâng cấp API Sơ đồ kho hỗ trợ lọc `status = 'ALL'</w:t>
             </w:r>
           </w:p>
         </w:tc>
@@ -4477,7 +4813,7 @@
                 <w:b/>
                 <w:sz w:val="19"/>
               </w:rPr>
-              <w:t>Thuan Le</w:t>
+              <w:t>Nam Nguyen</w:t>
             </w:r>
           </w:p>
         </w:tc>
@@ -4502,7 +4838,7 @@
                 <w:b/>
                 <w:sz w:val="19"/>
               </w:rPr>
-              <w:t>Hoàn thiện Chuyển kho, Nhập kho Đa vị trí, Kiểm soát Sức chứa Phân cấp &amp; Soft Delete Guard</w:t>
+              <w:t>Hoàn thiện Xuất kho Dispatch, Module Hàng hoàn trả (Returns / RMA) &amp; Tự động sinh Barcode</w:t>
             </w:r>
           </w:p>
         </w:tc>
@@ -4534,7 +4870,7 @@
                 <w:rFonts w:ascii="Calibri" w:hAnsi="Calibri"/>
                 <w:sz w:val="19"/>
               </w:rPr>
-              <w:t xml:space="preserve"> Hoàn tất API Nhận hàng chuyển kho (</w:t>
+              <w:t xml:space="preserve"> Hoàn thiện API Xuất kho - Dispatch (</w:t>
             </w:r>
             <w:r>
               <w:rPr>
@@ -4542,14 +4878,14 @@
                 <w:color w:val="9C4124"/>
                 <w:sz w:val="18"/>
               </w:rPr>
-              <w:t>POST /api/transfers/{id}/receive</w:t>
-            </w:r>
-            <w:r>
-              <w:rPr>
-                <w:rFonts w:ascii="Calibri" w:hAnsi="Calibri"/>
-                <w:sz w:val="19"/>
-              </w:rPr>
-              <w:t xml:space="preserve">): Cập nhật kho đích, xử lý trường hợp nhận thiếu sinh trạng thái </w:t>
+              <w:t>POST /api/shipments/{id}/dispatch</w:t>
+            </w:r>
+            <w:r>
+              <w:rPr>
+                <w:rFonts w:ascii="Calibri" w:hAnsi="Calibri"/>
+                <w:sz w:val="19"/>
+              </w:rPr>
+              <w:t xml:space="preserve">): Lưu vết </w:t>
             </w:r>
             <w:r>
               <w:rPr>
@@ -4557,14 +4893,14 @@
                 <w:color w:val="9C4124"/>
                 <w:sz w:val="18"/>
               </w:rPr>
-              <w:t>DISCREPANCY</w:t>
-            </w:r>
-            <w:r>
-              <w:rPr>
-                <w:rFonts w:ascii="Calibri" w:hAnsi="Calibri"/>
-                <w:sz w:val="19"/>
-              </w:rPr>
-              <w:t xml:space="preserve">, giữ hàng lơ lửng tại kho ảo </w:t>
+              <w:t>shipment_dispatch_lines</w:t>
+            </w:r>
+            <w:r>
+              <w:rPr>
+                <w:rFonts w:ascii="Calibri" w:hAnsi="Calibri"/>
+                <w:sz w:val="19"/>
+              </w:rPr>
+              <w:t xml:space="preserve">, cơ chế chống spam click bằng </w:t>
             </w:r>
             <w:r>
               <w:rPr>
@@ -4572,14 +4908,29 @@
                 <w:color w:val="9C4124"/>
                 <w:sz w:val="18"/>
               </w:rPr>
-              <w:t>TRANSIT</w:t>
-            </w:r>
-            <w:r>
-              <w:rPr>
-                <w:rFonts w:ascii="Calibri" w:hAnsi="Calibri"/>
-                <w:sz w:val="19"/>
-              </w:rPr>
-              <w:t>.</w:t>
+              <w:t>requestId</w:t>
+            </w:r>
+            <w:r>
+              <w:rPr>
+                <w:rFonts w:ascii="Calibri" w:hAnsi="Calibri"/>
+                <w:sz w:val="19"/>
+              </w:rPr>
+              <w:t xml:space="preserve"> (Idempotency), xử lý chuyển trạng thái </w:t>
+            </w:r>
+            <w:r>
+              <w:rPr>
+                <w:rFonts w:ascii="Consolas" w:hAnsi="Consolas"/>
+                <w:color w:val="9C4124"/>
+                <w:sz w:val="18"/>
+              </w:rPr>
+              <w:t>PARTIALLY_SHIPPED</w:t>
+            </w:r>
+            <w:r>
+              <w:rPr>
+                <w:rFonts w:ascii="Calibri" w:hAnsi="Calibri"/>
+                <w:sz w:val="19"/>
+              </w:rPr>
+              <w:t xml:space="preserve"> khi giao thiếu.</w:t>
             </w:r>
           </w:p>
           <w:p>
@@ -4592,14 +4943,14 @@
                 <w:b/>
                 <w:sz w:val="19"/>
               </w:rPr>
-              <w:t>Tuần 5 (Multi-destination Inbound):</w:t>
-            </w:r>
-            <w:r>
-              <w:rPr>
-                <w:rFonts w:ascii="Calibri" w:hAnsi="Calibri"/>
-                <w:sz w:val="19"/>
-              </w:rPr>
-              <w:t xml:space="preserve"> Bổ sung model </w:t>
+              <w:t>Tuần 5 (Module Returns):</w:t>
+            </w:r>
+            <w:r>
+              <w:rPr>
+                <w:rFonts w:ascii="Calibri" w:hAnsi="Calibri"/>
+                <w:sz w:val="19"/>
+              </w:rPr>
+              <w:t xml:space="preserve"> Tạo các model Prisma </w:t>
             </w:r>
             <w:r>
               <w:rPr>
@@ -4607,14 +4958,14 @@
                 <w:color w:val="9C4124"/>
                 <w:sz w:val="18"/>
               </w:rPr>
-              <w:t>ReceiptLineDetail</w:t>
-            </w:r>
-            <w:r>
-              <w:rPr>
-                <w:rFonts w:ascii="Calibri" w:hAnsi="Calibri"/>
-                <w:sz w:val="19"/>
-              </w:rPr>
-              <w:t>. Tái cấu trúc API Nhập kho (</w:t>
+              <w:t>ReturnOrder</w:t>
+            </w:r>
+            <w:r>
+              <w:rPr>
+                <w:rFonts w:ascii="Calibri" w:hAnsi="Calibri"/>
+                <w:sz w:val="19"/>
+              </w:rPr>
+              <w:t xml:space="preserve">, </w:t>
             </w:r>
             <w:r>
               <w:rPr>
@@ -4622,14 +4973,27 @@
                 <w:color w:val="9C4124"/>
                 <w:sz w:val="18"/>
               </w:rPr>
-              <w:t>POST /api/receipts/{id}/receive</w:t>
-            </w:r>
-            <w:r>
-              <w:rPr>
-                <w:rFonts w:ascii="Calibri" w:hAnsi="Calibri"/>
-                <w:sz w:val="19"/>
-              </w:rPr>
-              <w:t>) cho phép 1 dòng nhập phân bổ thành nhiều dòng con (</w:t>
+              <w:t>ReturnLine</w:t>
+            </w:r>
+            <w:r>
+              <w:rPr>
+                <w:rFonts w:ascii="Calibri" w:hAnsi="Calibri"/>
+                <w:sz w:val="19"/>
+              </w:rPr>
+              <w:t>. Viết trọn bộ API Hàng hoàn trả:</w:t>
+            </w:r>
+          </w:p>
+          <w:p>
+            <w:pPr>
+              <w:spacing w:before="20" w:after="40" w:line="276" w:lineRule="auto"/>
+              <w:ind w:left="216"/>
+            </w:pPr>
+            <w:r>
+              <w:rPr>
+                <w:rFonts w:ascii="Calibri" w:hAnsi="Calibri"/>
+                <w:sz w:val="19"/>
+              </w:rPr>
+              <w:t>• Tạo phiếu hoàn trả từ đơn xuất gốc (</w:t>
             </w:r>
             <w:r>
               <w:rPr>
@@ -4637,14 +5001,173 @@
                 <w:color w:val="9C4124"/>
                 <w:sz w:val="18"/>
               </w:rPr>
-              <w:t>allocations</w:t>
-            </w:r>
-            <w:r>
-              <w:rPr>
-                <w:rFonts w:ascii="Calibri" w:hAnsi="Calibri"/>
-                <w:sz w:val="19"/>
-              </w:rPr>
-              <w:t>) vào các ô khác nhau (Ô lưu trữ, Ô hàng hỏng cách ly).</w:t>
+              <w:t>POST /api/returns</w:t>
+            </w:r>
+            <w:r>
+              <w:rPr>
+                <w:rFonts w:ascii="Calibri" w:hAnsi="Calibri"/>
+                <w:sz w:val="19"/>
+              </w:rPr>
+              <w:t>).</w:t>
+            </w:r>
+          </w:p>
+          <w:p>
+            <w:pPr>
+              <w:spacing w:before="20" w:after="40" w:line="276" w:lineRule="auto"/>
+              <w:ind w:left="216"/>
+            </w:pPr>
+            <w:r>
+              <w:rPr>
+                <w:rFonts w:ascii="Calibri" w:hAnsi="Calibri"/>
+                <w:sz w:val="19"/>
+              </w:rPr>
+              <w:t>• Phân công nhân viên nhận hàng (</w:t>
+            </w:r>
+            <w:r>
+              <w:rPr>
+                <w:rFonts w:ascii="Consolas" w:hAnsi="Consolas"/>
+                <w:color w:val="9C4124"/>
+                <w:sz w:val="18"/>
+              </w:rPr>
+              <w:t>POST /api/returns/{id}/assign</w:t>
+            </w:r>
+            <w:r>
+              <w:rPr>
+                <w:rFonts w:ascii="Calibri" w:hAnsi="Calibri"/>
+                <w:sz w:val="19"/>
+              </w:rPr>
+              <w:t>).</w:t>
+            </w:r>
+          </w:p>
+          <w:p>
+            <w:pPr>
+              <w:spacing w:before="20" w:after="40" w:line="276" w:lineRule="auto"/>
+              <w:ind w:left="216"/>
+            </w:pPr>
+            <w:r>
+              <w:rPr>
+                <w:rFonts w:ascii="Calibri" w:hAnsi="Calibri"/>
+                <w:sz w:val="19"/>
+              </w:rPr>
+              <w:t>• Tiếp nhận cân thực tế tại cửa kho vào khu cách ly (</w:t>
+            </w:r>
+            <w:r>
+              <w:rPr>
+                <w:rFonts w:ascii="Consolas" w:hAnsi="Consolas"/>
+                <w:color w:val="9C4124"/>
+                <w:sz w:val="18"/>
+              </w:rPr>
+              <w:t>POST /api/returns/{id}/receive</w:t>
+            </w:r>
+            <w:r>
+              <w:rPr>
+                <w:rFonts w:ascii="Calibri" w:hAnsi="Calibri"/>
+                <w:sz w:val="19"/>
+              </w:rPr>
+              <w:t xml:space="preserve">): Bắt buộc nhận vào ô có </w:t>
+            </w:r>
+            <w:r>
+              <w:rPr>
+                <w:rFonts w:ascii="Consolas" w:hAnsi="Consolas"/>
+                <w:color w:val="9C4124"/>
+                <w:sz w:val="18"/>
+              </w:rPr>
+              <w:t>purpose = 'QC'</w:t>
+            </w:r>
+            <w:r>
+              <w:rPr>
+                <w:rFonts w:ascii="Calibri" w:hAnsi="Calibri"/>
+                <w:sz w:val="19"/>
+              </w:rPr>
+              <w:t xml:space="preserve"> hoặc </w:t>
+            </w:r>
+            <w:r>
+              <w:rPr>
+                <w:rFonts w:ascii="Consolas" w:hAnsi="Consolas"/>
+                <w:color w:val="9C4124"/>
+                <w:sz w:val="18"/>
+              </w:rPr>
+              <w:t>'DAMAGED'</w:t>
+            </w:r>
+            <w:r>
+              <w:rPr>
+                <w:rFonts w:ascii="Calibri" w:hAnsi="Calibri"/>
+                <w:sz w:val="19"/>
+              </w:rPr>
+              <w:t xml:space="preserve">, ghi sổ cái loại </w:t>
+            </w:r>
+            <w:r>
+              <w:rPr>
+                <w:rFonts w:ascii="Consolas" w:hAnsi="Consolas"/>
+                <w:color w:val="9C4124"/>
+                <w:sz w:val="18"/>
+              </w:rPr>
+              <w:t>RETURN</w:t>
+            </w:r>
+            <w:r>
+              <w:rPr>
+                <w:rFonts w:ascii="Calibri" w:hAnsi="Calibri"/>
+                <w:sz w:val="19"/>
+              </w:rPr>
+              <w:t xml:space="preserve"> cách ly không bán được.</w:t>
+            </w:r>
+          </w:p>
+          <w:p>
+            <w:pPr>
+              <w:spacing w:before="20" w:after="40" w:line="276" w:lineRule="auto"/>
+              <w:ind w:left="216"/>
+            </w:pPr>
+            <w:r>
+              <w:rPr>
+                <w:rFonts w:ascii="Calibri" w:hAnsi="Calibri"/>
+                <w:sz w:val="19"/>
+              </w:rPr>
+              <w:t>• Kiểm định chất lượng (</w:t>
+            </w:r>
+            <w:r>
+              <w:rPr>
+                <w:rFonts w:ascii="Consolas" w:hAnsi="Consolas"/>
+                <w:color w:val="9C4124"/>
+                <w:sz w:val="18"/>
+              </w:rPr>
+              <w:t>POST /api/returns/{id}/inspect</w:t>
+            </w:r>
+            <w:r>
+              <w:rPr>
+                <w:rFonts w:ascii="Calibri" w:hAnsi="Calibri"/>
+                <w:sz w:val="19"/>
+              </w:rPr>
+              <w:t xml:space="preserve">): Xử lý 2 nhánh </w:t>
+            </w:r>
+            <w:r>
+              <w:rPr>
+                <w:rFonts w:ascii="Consolas" w:hAnsi="Consolas"/>
+                <w:color w:val="9C4124"/>
+                <w:sz w:val="18"/>
+              </w:rPr>
+              <w:t>RESTOCK</w:t>
+            </w:r>
+            <w:r>
+              <w:rPr>
+                <w:rFonts w:ascii="Calibri" w:hAnsi="Calibri"/>
+                <w:sz w:val="19"/>
+              </w:rPr>
+              <w:t xml:space="preserve"> (nhập lại ô bán) hoặc </w:t>
+            </w:r>
+            <w:r>
+              <w:rPr>
+                <w:rFonts w:ascii="Consolas" w:hAnsi="Consolas"/>
+                <w:color w:val="9C4124"/>
+                <w:sz w:val="18"/>
+              </w:rPr>
+              <w:t>SCRAP</w:t>
+            </w:r>
+            <w:r>
+              <w:rPr>
+                <w:rFonts w:ascii="Calibri" w:hAnsi="Calibri"/>
+                <w:sz w:val="19"/>
+              </w:rPr>
+              <w:t xml:space="preserve"> (tiêu hủy).</w:t>
             </w:r>
           </w:p>
           <w:p>
@@ -4657,14 +5180,14 @@
                 <w:b/>
                 <w:sz w:val="19"/>
               </w:rPr>
-              <w:t>Tuần 5 (Capacity Control):</w:t>
-            </w:r>
-            <w:r>
-              <w:rPr>
-                <w:rFonts w:ascii="Calibri" w:hAnsi="Calibri"/>
-                <w:sz w:val="19"/>
-              </w:rPr>
-              <w:t xml:space="preserve"> Thêm trường </w:t>
+              <w:t>Tuần 5 (Barcode):</w:t>
+            </w:r>
+            <w:r>
+              <w:rPr>
+                <w:rFonts w:ascii="Calibri" w:hAnsi="Calibri"/>
+                <w:sz w:val="19"/>
+              </w:rPr>
+              <w:t xml:space="preserve"> Triển khai logic Backend tự động sinh mã vạch chuẩn </w:t>
             </w:r>
             <w:r>
               <w:rPr>
@@ -4672,154 +5195,14 @@
                 <w:color w:val="9C4124"/>
                 <w:sz w:val="18"/>
               </w:rPr>
-              <w:t>maxWeight</w:t>
-            </w:r>
-            <w:r>
-              <w:rPr>
-                <w:rFonts w:ascii="Calibri" w:hAnsi="Calibri"/>
-                <w:sz w:val="19"/>
-              </w:rPr>
-              <w:t xml:space="preserve"> và </w:t>
-            </w:r>
-            <w:r>
-              <w:rPr>
-                <w:rFonts w:ascii="Consolas" w:hAnsi="Consolas"/>
-                <w:color w:val="9C4124"/>
-                <w:sz w:val="18"/>
-              </w:rPr>
-              <w:t>maxVolume</w:t>
-            </w:r>
-            <w:r>
-              <w:rPr>
-                <w:rFonts w:ascii="Calibri" w:hAnsi="Calibri"/>
-                <w:sz w:val="19"/>
-              </w:rPr>
-              <w:t xml:space="preserve"> vào </w:t>
-            </w:r>
-            <w:r>
-              <w:rPr>
-                <w:rFonts w:ascii="Consolas" w:hAnsi="Consolas"/>
-                <w:color w:val="9C4124"/>
-                <w:sz w:val="18"/>
-              </w:rPr>
-              <w:t>Warehouse</w:t>
-            </w:r>
-            <w:r>
-              <w:rPr>
-                <w:rFonts w:ascii="Calibri" w:hAnsi="Calibri"/>
-                <w:sz w:val="19"/>
-              </w:rPr>
-              <w:t xml:space="preserve">. Lập trình thuật toán kiểm soát dung lượng phân cấp hình tháp: $∑ \text{con} ≤ \text{giới hạn cha}$ ở mọi tầng. Chặn ném lỗi </w:t>
-            </w:r>
-            <w:r>
-              <w:rPr>
-                <w:rFonts w:ascii="Consolas" w:hAnsi="Consolas"/>
-                <w:color w:val="9C4124"/>
-                <w:sz w:val="18"/>
-              </w:rPr>
-              <w:t>400</w:t>
-            </w:r>
-            <w:r>
-              <w:rPr>
-                <w:rFonts w:ascii="Calibri" w:hAnsi="Calibri"/>
-                <w:sz w:val="19"/>
-              </w:rPr>
-              <w:t xml:space="preserve"> nếu hàng nhập làm vượt sức chứa của ô/kho.</w:t>
-            </w:r>
-          </w:p>
-          <w:p>
-            <w:pPr>
-              <w:spacing w:before="20" w:after="40" w:line="276" w:lineRule="auto"/>
-            </w:pPr>
-            <w:r>
-              <w:rPr>
-                <w:rFonts w:ascii="Calibri" w:hAnsi="Calibri"/>
-                <w:b/>
-                <w:sz w:val="19"/>
-              </w:rPr>
-              <w:t>Tuần 5 (Soft Delete Guard):</w:t>
-            </w:r>
-            <w:r>
-              <w:rPr>
-                <w:rFonts w:ascii="Calibri" w:hAnsi="Calibri"/>
-                <w:sz w:val="19"/>
-              </w:rPr>
-              <w:t xml:space="preserve"> Bổ sung cơ chế bảo vệ an toàn kho tại </w:t>
-            </w:r>
-            <w:r>
-              <w:rPr>
-                <w:rFonts w:ascii="Consolas" w:hAnsi="Consolas"/>
-                <w:color w:val="9C4124"/>
-                <w:sz w:val="18"/>
-              </w:rPr>
-              <w:t>DELETE /api/warehouses/:id</w:t>
-            </w:r>
-            <w:r>
-              <w:rPr>
-                <w:rFonts w:ascii="Calibri" w:hAnsi="Calibri"/>
-                <w:sz w:val="19"/>
-              </w:rPr>
-              <w:t xml:space="preserve"> và </w:t>
-            </w:r>
-            <w:r>
-              <w:rPr>
-                <w:rFonts w:ascii="Consolas" w:hAnsi="Consolas"/>
-                <w:color w:val="9C4124"/>
-                <w:sz w:val="18"/>
-              </w:rPr>
-              <w:t>PUT /api/warehouses/:id</w:t>
-            </w:r>
-            <w:r>
-              <w:rPr>
-                <w:rFonts w:ascii="Calibri" w:hAnsi="Calibri"/>
-                <w:sz w:val="19"/>
-              </w:rPr>
-              <w:t xml:space="preserve"> (khi đổi </w:t>
-            </w:r>
-            <w:r>
-              <w:rPr>
-                <w:rFonts w:ascii="Consolas" w:hAnsi="Consolas"/>
-                <w:color w:val="9C4124"/>
-                <w:sz w:val="18"/>
-              </w:rPr>
-              <w:t>status: 'INACTIVE'</w:t>
-            </w:r>
-            <w:r>
-              <w:rPr>
-                <w:rFonts w:ascii="Calibri" w:hAnsi="Calibri"/>
-                <w:sz w:val="19"/>
-              </w:rPr>
-              <w:t xml:space="preserve">). Chặn và ném lỗi </w:t>
-            </w:r>
-            <w:r>
-              <w:rPr>
-                <w:rFonts w:ascii="Consolas" w:hAnsi="Consolas"/>
-                <w:color w:val="9C4124"/>
-                <w:sz w:val="18"/>
-              </w:rPr>
-              <w:t>400 Bad Request</w:t>
-            </w:r>
-            <w:r>
-              <w:rPr>
-                <w:rFonts w:ascii="Calibri" w:hAnsi="Calibri"/>
-                <w:sz w:val="19"/>
-              </w:rPr>
-              <w:t xml:space="preserve"> nếu trong kho còn bất kỳ mặt hàng nào có </w:t>
-            </w:r>
-            <w:r>
-              <w:rPr>
-                <w:rFonts w:ascii="Consolas" w:hAnsi="Consolas"/>
-                <w:color w:val="9C4124"/>
-                <w:sz w:val="18"/>
-              </w:rPr>
-              <w:t>qtyOnHand &gt; 0</w:t>
-            </w:r>
-            <w:r>
-              <w:rPr>
-                <w:rFonts w:ascii="Calibri" w:hAnsi="Calibri"/>
-                <w:sz w:val="19"/>
-              </w:rPr>
-              <w:t>.</w:t>
+              <w:t>BAR-{skuCode}-{uomCode}</w:t>
+            </w:r>
+            <w:r>
+              <w:rPr>
+                <w:rFonts w:ascii="Calibri" w:hAnsi="Calibri"/>
+                <w:sz w:val="19"/>
+              </w:rPr>
+              <w:t xml:space="preserve"> khi tạo mới quy đổi đơn vị tính.</w:t>
             </w:r>
           </w:p>
         </w:tc>
@@ -4849,7 +5232,7 @@
                 <w:b/>
                 <w:sz w:val="19"/>
               </w:rPr>
-              <w:t>Trung Pham</w:t>
+              <w:t>Thuan Le</w:t>
             </w:r>
           </w:p>
         </w:tc>
@@ -4874,7 +5257,7 @@
                 <w:b/>
                 <w:sz w:val="19"/>
               </w:rPr>
-              <w:t>Đóng gói Bút toán đảo, Quản trị Bảo mật/RBAC, Cảnh báo Cận date, Sơ đồ kho &amp; Hệ thống Dashboard 5 Role</w:t>
+              <w:t>Hoàn thiện Chuyển kho, Nhập kho Đa vị trí, Kiểm soát Sức chứa Phân cấp &amp; Soft Delete Guard</w:t>
             </w:r>
           </w:p>
         </w:tc>
@@ -4906,7 +5289,7 @@
                 <w:rFonts w:ascii="Calibri" w:hAnsi="Calibri"/>
                 <w:sz w:val="19"/>
               </w:rPr>
-              <w:t xml:space="preserve"> Hoàn thiện API duyệt Bút toán đảo (</w:t>
+              <w:t xml:space="preserve"> Hoàn tất API Nhận hàng chuyển kho (</w:t>
             </w:r>
             <w:r>
               <w:rPr>
@@ -4914,14 +5297,14 @@
                 <w:color w:val="9C4124"/>
                 <w:sz w:val="18"/>
               </w:rPr>
-              <w:t>/api/reversals/requests/{id}/approve</w:t>
-            </w:r>
-            <w:r>
-              <w:rPr>
-                <w:rFonts w:ascii="Calibri" w:hAnsi="Calibri"/>
-                <w:sz w:val="19"/>
-              </w:rPr>
-              <w:t xml:space="preserve">): Đóng gói thành hàm chuyên biệt </w:t>
+              <w:t>POST /api/transfers/{id}/receive</w:t>
+            </w:r>
+            <w:r>
+              <w:rPr>
+                <w:rFonts w:ascii="Calibri" w:hAnsi="Calibri"/>
+                <w:sz w:val="19"/>
+              </w:rPr>
+              <w:t xml:space="preserve">): Cập nhật kho đích, xử lý trường hợp nhận thiếu sinh trạng thái </w:t>
             </w:r>
             <w:r>
               <w:rPr>
@@ -4929,14 +5312,14 @@
                 <w:color w:val="9C4124"/>
                 <w:sz w:val="18"/>
               </w:rPr>
-              <w:t>executeReversal(...)</w:t>
-            </w:r>
-            <w:r>
-              <w:rPr>
-                <w:rFonts w:ascii="Calibri" w:hAnsi="Calibri"/>
-                <w:sz w:val="19"/>
-              </w:rPr>
-              <w:t xml:space="preserve"> trong </w:t>
+              <w:t>DISCREPANCY</w:t>
+            </w:r>
+            <w:r>
+              <w:rPr>
+                <w:rFonts w:ascii="Calibri" w:hAnsi="Calibri"/>
+                <w:sz w:val="19"/>
+              </w:rPr>
+              <w:t xml:space="preserve">, giữ hàng lơ lửng tại kho ảo </w:t>
             </w:r>
             <w:r>
               <w:rPr>
@@ -4944,14 +5327,14 @@
                 <w:color w:val="9C4124"/>
                 <w:sz w:val="18"/>
               </w:rPr>
-              <w:t>InventoryLedgerService</w:t>
-            </w:r>
-            <w:r>
-              <w:rPr>
-                <w:rFonts w:ascii="Calibri" w:hAnsi="Calibri"/>
-                <w:sz w:val="19"/>
-              </w:rPr>
-              <w:t>, kiểm tra nghiêm ngặt</w:t>
+              <w:t>TRANSIT</w:t>
+            </w:r>
+            <w:r>
+              <w:rPr>
+                <w:rFonts w:ascii="Calibri" w:hAnsi="Calibri"/>
+                <w:sz w:val="19"/>
+              </w:rPr>
+              <w:t>.</w:t>
             </w:r>
           </w:p>
           <w:p>
@@ -4964,14 +5347,14 @@
                 <w:b/>
                 <w:sz w:val="19"/>
               </w:rPr>
-              <w:t>Tuần 5 (Security &amp; RBAC):</w:t>
-            </w:r>
-            <w:r>
-              <w:rPr>
-                <w:rFonts w:ascii="Calibri" w:hAnsi="Calibri"/>
-                <w:sz w:val="19"/>
-              </w:rPr>
-              <w:t xml:space="preserve"> Cập nhật enum mã quyền mới (</w:t>
+              <w:t>Tuần 5 (Multi-destination Inbound):</w:t>
+            </w:r>
+            <w:r>
+              <w:rPr>
+                <w:rFonts w:ascii="Calibri" w:hAnsi="Calibri"/>
+                <w:sz w:val="19"/>
+              </w:rPr>
+              <w:t xml:space="preserve"> Bổ sung model </w:t>
             </w:r>
             <w:r>
               <w:rPr>
@@ -4979,14 +5362,14 @@
                 <w:color w:val="9C4124"/>
                 <w:sz w:val="18"/>
               </w:rPr>
-              <w:t>RETURN.*</w:t>
-            </w:r>
-            <w:r>
-              <w:rPr>
-                <w:rFonts w:ascii="Calibri" w:hAnsi="Calibri"/>
-                <w:sz w:val="19"/>
-              </w:rPr>
-              <w:t xml:space="preserve">, </w:t>
+              <w:t>ReceiptLineDetail</w:t>
+            </w:r>
+            <w:r>
+              <w:rPr>
+                <w:rFonts w:ascii="Calibri" w:hAnsi="Calibri"/>
+                <w:sz w:val="19"/>
+              </w:rPr>
+              <w:t>. Tái cấu trúc API Nhập kho (</w:t>
             </w:r>
             <w:r>
               <w:rPr>
@@ -4994,14 +5377,14 @@
                 <w:color w:val="9C4124"/>
                 <w:sz w:val="18"/>
               </w:rPr>
-              <w:t>DASHBOARD_READ</w:t>
-            </w:r>
-            <w:r>
-              <w:rPr>
-                <w:rFonts w:ascii="Calibri" w:hAnsi="Calibri"/>
-                <w:sz w:val="19"/>
-              </w:rPr>
-              <w:t xml:space="preserve">, </w:t>
+              <w:t>POST /api/receipts/{id}/receive</w:t>
+            </w:r>
+            <w:r>
+              <w:rPr>
+                <w:rFonts w:ascii="Calibri" w:hAnsi="Calibri"/>
+                <w:sz w:val="19"/>
+              </w:rPr>
+              <w:t>) cho phép 1 dòng nhập phân bổ thành nhiều dòng con (</w:t>
             </w:r>
             <w:r>
               <w:rPr>
@@ -5009,44 +5392,14 @@
                 <w:color w:val="9C4124"/>
                 <w:sz w:val="18"/>
               </w:rPr>
-              <w:t>USER_RESET_PASSWORD</w:t>
-            </w:r>
-            <w:r>
-              <w:rPr>
-                <w:rFonts w:ascii="Calibri" w:hAnsi="Calibri"/>
-                <w:sz w:val="19"/>
-              </w:rPr>
-              <w:t xml:space="preserve">), cập nhật </w:t>
-            </w:r>
-            <w:r>
-              <w:rPr>
-                <w:rFonts w:ascii="Consolas" w:hAnsi="Consolas"/>
-                <w:color w:val="9C4124"/>
-                <w:sz w:val="18"/>
-              </w:rPr>
-              <w:t>permission-defaults.ts</w:t>
-            </w:r>
-            <w:r>
-              <w:rPr>
-                <w:rFonts w:ascii="Calibri" w:hAnsi="Calibri"/>
-                <w:sz w:val="19"/>
-              </w:rPr>
-              <w:t xml:space="preserve"> và chạy Patch script cập nhật quyền vào CSDL. Viết API Reset Password cho Admin (</w:t>
-            </w:r>
-            <w:r>
-              <w:rPr>
-                <w:rFonts w:ascii="Consolas" w:hAnsi="Consolas"/>
-                <w:color w:val="9C4124"/>
-                <w:sz w:val="18"/>
-              </w:rPr>
-              <w:t>POST /api/users/{id}/reset-password</w:t>
-            </w:r>
-            <w:r>
-              <w:rPr>
-                <w:rFonts w:ascii="Calibri" w:hAnsi="Calibri"/>
-                <w:sz w:val="19"/>
-              </w:rPr>
-              <w:t>).</w:t>
+              <w:t>allocations</w:t>
+            </w:r>
+            <w:r>
+              <w:rPr>
+                <w:rFonts w:ascii="Calibri" w:hAnsi="Calibri"/>
+                <w:sz w:val="19"/>
+              </w:rPr>
+              <w:t>) vào các ô khác nhau (Ô lưu trữ, Ô hàng hỏng cách ly).</w:t>
             </w:r>
           </w:p>
           <w:p>
@@ -5059,14 +5412,14 @@
                 <w:b/>
                 <w:sz w:val="19"/>
               </w:rPr>
-              <w:t>Tuần 5 (Cảnh báo &amp; Sơ đồ kho):</w:t>
-            </w:r>
-            <w:r>
-              <w:rPr>
-                <w:rFonts w:ascii="Calibri" w:hAnsi="Calibri"/>
-                <w:sz w:val="19"/>
-              </w:rPr>
-              <w:t xml:space="preserve"> Bổ sung tính toán động </w:t>
+              <w:t>Tuần 5 (Capacity Control):</w:t>
+            </w:r>
+            <w:r>
+              <w:rPr>
+                <w:rFonts w:ascii="Calibri" w:hAnsi="Calibri"/>
+                <w:sz w:val="19"/>
+              </w:rPr>
+              <w:t xml:space="preserve"> Thêm trường </w:t>
             </w:r>
             <w:r>
               <w:rPr>
@@ -5074,14 +5427,14 @@
                 <w:color w:val="9C4124"/>
                 <w:sz w:val="18"/>
               </w:rPr>
-              <w:t>daysUntilExpiry</w:t>
-            </w:r>
-            <w:r>
-              <w:rPr>
-                <w:rFonts w:ascii="Calibri" w:hAnsi="Calibri"/>
-                <w:sz w:val="19"/>
-              </w:rPr>
-              <w:t xml:space="preserve"> và cờ cảnh báo </w:t>
+              <w:t>maxWeight</w:t>
+            </w:r>
+            <w:r>
+              <w:rPr>
+                <w:rFonts w:ascii="Calibri" w:hAnsi="Calibri"/>
+                <w:sz w:val="19"/>
+              </w:rPr>
+              <w:t xml:space="preserve"> và </w:t>
             </w:r>
             <w:r>
               <w:rPr>
@@ -5089,14 +5442,14 @@
                 <w:color w:val="9C4124"/>
                 <w:sz w:val="18"/>
               </w:rPr>
-              <w:t>expiryAlert</w:t>
-            </w:r>
-            <w:r>
-              <w:rPr>
-                <w:rFonts w:ascii="Calibri" w:hAnsi="Calibri"/>
-                <w:sz w:val="19"/>
-              </w:rPr>
-              <w:t xml:space="preserve"> (</w:t>
+              <w:t>maxVolume</w:t>
+            </w:r>
+            <w:r>
+              <w:rPr>
+                <w:rFonts w:ascii="Calibri" w:hAnsi="Calibri"/>
+                <w:sz w:val="19"/>
+              </w:rPr>
+              <w:t xml:space="preserve"> vào </w:t>
             </w:r>
             <w:r>
               <w:rPr>
@@ -5104,14 +5457,14 @@
                 <w:color w:val="9C4124"/>
                 <w:sz w:val="18"/>
               </w:rPr>
-              <w:t>CRITICAL</w:t>
-            </w:r>
-            <w:r>
-              <w:rPr>
-                <w:rFonts w:ascii="Calibri" w:hAnsi="Calibri"/>
-                <w:sz w:val="19"/>
-              </w:rPr>
-              <w:t xml:space="preserve">, </w:t>
+              <w:t>Warehouse</w:t>
+            </w:r>
+            <w:r>
+              <w:rPr>
+                <w:rFonts w:ascii="Calibri" w:hAnsi="Calibri"/>
+                <w:sz w:val="19"/>
+              </w:rPr>
+              <w:t xml:space="preserve">. Lập trình thuật toán kiểm soát dung lượng phân cấp hình tháp: $∑ \text{con} ≤ \text{giới hạn cha}$ ở mọi tầng. Chặn ném lỗi </w:t>
             </w:r>
             <w:r>
               <w:rPr>
@@ -5119,14 +5472,34 @@
                 <w:color w:val="9C4124"/>
                 <w:sz w:val="18"/>
               </w:rPr>
-              <w:t>WARNING</w:t>
-            </w:r>
-            <w:r>
-              <w:rPr>
-                <w:rFonts w:ascii="Calibri" w:hAnsi="Calibri"/>
-                <w:sz w:val="19"/>
-              </w:rPr>
-              <w:t xml:space="preserve">, </w:t>
+              <w:t>400</w:t>
+            </w:r>
+            <w:r>
+              <w:rPr>
+                <w:rFonts w:ascii="Calibri" w:hAnsi="Calibri"/>
+                <w:sz w:val="19"/>
+              </w:rPr>
+              <w:t xml:space="preserve"> nếu hàng nhập làm vượt sức chứa của ô/kho.</w:t>
+            </w:r>
+          </w:p>
+          <w:p>
+            <w:pPr>
+              <w:spacing w:before="20" w:after="40" w:line="276" w:lineRule="auto"/>
+            </w:pPr>
+            <w:r>
+              <w:rPr>
+                <w:rFonts w:ascii="Calibri" w:hAnsi="Calibri"/>
+                <w:b/>
+                <w:sz w:val="19"/>
+              </w:rPr>
+              <w:t>Tuần 5 (Soft Delete Guard):</w:t>
+            </w:r>
+            <w:r>
+              <w:rPr>
+                <w:rFonts w:ascii="Calibri" w:hAnsi="Calibri"/>
+                <w:sz w:val="19"/>
+              </w:rPr>
+              <w:t xml:space="preserve"> Bổ sung cơ chế bảo vệ an toàn kho tại </w:t>
             </w:r>
             <w:r>
               <w:rPr>
@@ -5134,14 +5507,74 @@
                 <w:color w:val="9C4124"/>
                 <w:sz w:val="18"/>
               </w:rPr>
-              <w:t>NORMAL</w:t>
-            </w:r>
-            <w:r>
-              <w:rPr>
-                <w:rFonts w:ascii="Calibri" w:hAnsi="Calibri"/>
-                <w:sz w:val="19"/>
-              </w:rPr>
-              <w:t>) trong API Tồn kho. Nâng cấp API Sơ đồ kho hỗ trợ lọc `status = 'ALL'</w:t>
+              <w:t>DELETE /api/warehouses/:id</w:t>
+            </w:r>
+            <w:r>
+              <w:rPr>
+                <w:rFonts w:ascii="Calibri" w:hAnsi="Calibri"/>
+                <w:sz w:val="19"/>
+              </w:rPr>
+              <w:t xml:space="preserve"> và </w:t>
+            </w:r>
+            <w:r>
+              <w:rPr>
+                <w:rFonts w:ascii="Consolas" w:hAnsi="Consolas"/>
+                <w:color w:val="9C4124"/>
+                <w:sz w:val="18"/>
+              </w:rPr>
+              <w:t>PUT /api/warehouses/:id</w:t>
+            </w:r>
+            <w:r>
+              <w:rPr>
+                <w:rFonts w:ascii="Calibri" w:hAnsi="Calibri"/>
+                <w:sz w:val="19"/>
+              </w:rPr>
+              <w:t xml:space="preserve"> (khi đổi </w:t>
+            </w:r>
+            <w:r>
+              <w:rPr>
+                <w:rFonts w:ascii="Consolas" w:hAnsi="Consolas"/>
+                <w:color w:val="9C4124"/>
+                <w:sz w:val="18"/>
+              </w:rPr>
+              <w:t>status: 'INACTIVE'</w:t>
+            </w:r>
+            <w:r>
+              <w:rPr>
+                <w:rFonts w:ascii="Calibri" w:hAnsi="Calibri"/>
+                <w:sz w:val="19"/>
+              </w:rPr>
+              <w:t xml:space="preserve">). Chặn và ném lỗi </w:t>
+            </w:r>
+            <w:r>
+              <w:rPr>
+                <w:rFonts w:ascii="Consolas" w:hAnsi="Consolas"/>
+                <w:color w:val="9C4124"/>
+                <w:sz w:val="18"/>
+              </w:rPr>
+              <w:t>400 Bad Request</w:t>
+            </w:r>
+            <w:r>
+              <w:rPr>
+                <w:rFonts w:ascii="Calibri" w:hAnsi="Calibri"/>
+                <w:sz w:val="19"/>
+              </w:rPr>
+              <w:t xml:space="preserve"> nếu trong kho còn bất kỳ mặt hàng nào có </w:t>
+            </w:r>
+            <w:r>
+              <w:rPr>
+                <w:rFonts w:ascii="Consolas" w:hAnsi="Consolas"/>
+                <w:color w:val="9C4124"/>
+                <w:sz w:val="18"/>
+              </w:rPr>
+              <w:t>qtyOnHand &gt; 0</w:t>
+            </w:r>
+            <w:r>
+              <w:rPr>
+                <w:rFonts w:ascii="Calibri" w:hAnsi="Calibri"/>
+                <w:sz w:val="19"/>
+              </w:rPr>
+              <w:t>.</w:t>
             </w:r>
           </w:p>
         </w:tc>
@@ -5563,7 +5996,7 @@
                 <w:b/>
                 <w:sz w:val="19"/>
               </w:rPr>
-              <w:t>1</w:t>
+              <w:t>0</w:t>
             </w:r>
           </w:p>
         </w:tc>
@@ -5581,14 +6014,14 @@
           <w:p>
             <w:pPr>
               <w:spacing w:before="20" w:after="40" w:line="276" w:lineRule="auto"/>
-              <w:jc w:val="left"/>
             </w:pPr>
             <w:r>
               <w:rPr>
                 <w:rFonts w:ascii="Calibri" w:hAnsi="Calibri"/>
-                <w:sz w:val="19"/>
-              </w:rPr>
-              <w:t>Quy ước chung, Thiết kế ERD &amp; Business Flow</w:t>
+                <w:b/>
+                <w:sz w:val="19"/>
+              </w:rPr>
+              <w:t>Quản trị Dự án: Lập Plan, Phân công việc, Lấy ý kiến &amp; Kiểm thử thủ công</w:t>
             </w:r>
           </w:p>
         </w:tc>
@@ -5611,9 +6044,10 @@
             <w:r>
               <w:rPr>
                 <w:rFonts w:ascii="Calibri" w:hAnsi="Calibri"/>
-                <w:sz w:val="19"/>
-              </w:rPr>
-              <w:t>Giai đoạn 1</w:t>
+                <w:b/>
+                <w:sz w:val="19"/>
+              </w:rPr>
+              <w:t>Xuyên suốt GĐ 1, 2, 3</w:t>
             </w:r>
           </w:p>
         </w:tc>
@@ -5636,9 +6070,10 @@
             <w:r>
               <w:rPr>
                 <w:rFonts w:ascii="Calibri" w:hAnsi="Calibri"/>
-                <w:sz w:val="19"/>
-              </w:rPr>
-              <w:t>Thuan Le, Nam Nguyen, Trung Pham</w:t>
+                <w:b/>
+                <w:sz w:val="19"/>
+              </w:rPr>
+              <w:t>Trung Pham (Leader)</w:t>
             </w:r>
           </w:p>
         </w:tc>
@@ -5661,9 +6096,10 @@
             <w:r>
               <w:rPr>
                 <w:rFonts w:ascii="Calibri" w:hAnsi="Calibri"/>
-                <w:sz w:val="19"/>
-              </w:rPr>
-              <w:t>Vy Tran</w:t>
+                <w:b/>
+                <w:sz w:val="19"/>
+              </w:rPr>
+              <w:t>Vy Tran (Phối hợp)</w:t>
             </w:r>
           </w:p>
         </w:tc>
@@ -5686,6 +6122,7 @@
             <w:r>
               <w:rPr>
                 <w:rFonts w:ascii="Calibri" w:hAnsi="Calibri"/>
+                <w:b/>
                 <w:sz w:val="19"/>
               </w:rPr>
               <w:t>Hoàn thành</w:t>
@@ -5718,7 +6155,7 @@
                 <w:b/>
                 <w:sz w:val="19"/>
               </w:rPr>
-              <w:t>2</w:t>
+              <w:t>1</w:t>
             </w:r>
           </w:p>
         </w:tc>
@@ -5736,14 +6173,13 @@
           <w:p>
             <w:pPr>
               <w:spacing w:before="20" w:after="40" w:line="276" w:lineRule="auto"/>
-              <w:jc w:val="left"/>
             </w:pPr>
             <w:r>
               <w:rPr>
                 <w:rFonts w:ascii="Calibri" w:hAnsi="Calibri"/>
                 <w:sz w:val="19"/>
               </w:rPr>
-              <w:t>Đăng nhập, Quản lý User &amp; Phân quyền RBAC</w:t>
+              <w:t>Quy ước chung, Thiết kế ERD &amp; Business Flow</w:t>
             </w:r>
           </w:p>
         </w:tc>
@@ -5768,7 +6204,7 @@
                 <w:rFonts w:ascii="Calibri" w:hAnsi="Calibri"/>
                 <w:sz w:val="19"/>
               </w:rPr>
-              <w:t>Giai đoạn 2</w:t>
+              <w:t>Giai đoạn 1</w:t>
             </w:r>
           </w:p>
         </w:tc>
@@ -5793,7 +6229,7 @@
                 <w:rFonts w:ascii="Calibri" w:hAnsi="Calibri"/>
                 <w:sz w:val="19"/>
               </w:rPr>
-              <w:t>Nam Nguyen</w:t>
+              <w:t>Thuan Le, Nam Nguyen, Trung Pham</w:t>
             </w:r>
           </w:p>
         </w:tc>
@@ -5873,7 +6309,7 @@
                 <w:b/>
                 <w:sz w:val="19"/>
               </w:rPr>
-              <w:t>3</w:t>
+              <w:t>2</w:t>
             </w:r>
           </w:p>
         </w:tc>
@@ -5891,14 +6327,13 @@
           <w:p>
             <w:pPr>
               <w:spacing w:before="20" w:after="40" w:line="276" w:lineRule="auto"/>
-              <w:jc w:val="left"/>
             </w:pPr>
             <w:r>
               <w:rPr>
                 <w:rFonts w:ascii="Calibri" w:hAnsi="Calibri"/>
                 <w:sz w:val="19"/>
               </w:rPr>
-              <w:t>Master Data: Kho, Vị trí, Đơn vị tính (UOM), Sản phẩm (SKU)</w:t>
+              <w:t>Đăng nhập, Quản lý User &amp; Phân quyền RBAC</w:t>
             </w:r>
           </w:p>
         </w:tc>
@@ -5948,7 +6383,7 @@
                 <w:rFonts w:ascii="Calibri" w:hAnsi="Calibri"/>
                 <w:sz w:val="19"/>
               </w:rPr>
-              <w:t>Trung Pham</w:t>
+              <w:t>Nam Nguyen</w:t>
             </w:r>
           </w:p>
         </w:tc>
@@ -6028,7 +6463,7 @@
                 <w:b/>
                 <w:sz w:val="19"/>
               </w:rPr>
-              <w:t>4</w:t>
+              <w:t>3</w:t>
             </w:r>
           </w:p>
         </w:tc>
@@ -6046,29 +6481,13 @@
           <w:p>
             <w:pPr>
               <w:spacing w:before="20" w:after="40" w:line="276" w:lineRule="auto"/>
-              <w:jc w:val="left"/>
             </w:pPr>
             <w:r>
               <w:rPr>
                 <w:rFonts w:ascii="Calibri" w:hAnsi="Calibri"/>
                 <w:sz w:val="19"/>
               </w:rPr>
-              <w:t>Core Sổ cái Tồn kho (</w:t>
-            </w:r>
-            <w:r>
-              <w:rPr>
-                <w:rFonts w:ascii="Consolas" w:hAnsi="Consolas"/>
-                <w:color w:val="9C4124"/>
-                <w:sz w:val="18"/>
-              </w:rPr>
-              <w:t>InventoryLedgerService</w:t>
-            </w:r>
-            <w:r>
-              <w:rPr>
-                <w:rFonts w:ascii="Calibri" w:hAnsi="Calibri"/>
-                <w:sz w:val="19"/>
-              </w:rPr>
-              <w:t>) &amp; Tra cứu Tồn</w:t>
+              <w:t>Master Data: Kho, Vị trí, Đơn vị tính (UOM), Sản phẩm (SKU)</w:t>
             </w:r>
           </w:p>
         </w:tc>
@@ -6118,7 +6537,7 @@
                 <w:rFonts w:ascii="Calibri" w:hAnsi="Calibri"/>
                 <w:sz w:val="19"/>
               </w:rPr>
-              <w:t>Thuan Le</w:t>
+              <w:t>Trung Pham</w:t>
             </w:r>
           </w:p>
         </w:tc>
@@ -6198,7 +6617,7 @@
                 <w:b/>
                 <w:sz w:val="19"/>
               </w:rPr>
-              <w:t>5</w:t>
+              <w:t>4</w:t>
             </w:r>
           </w:p>
         </w:tc>
@@ -6216,14 +6635,28 @@
           <w:p>
             <w:pPr>
               <w:spacing w:before="20" w:after="40" w:line="276" w:lineRule="auto"/>
-              <w:jc w:val="left"/>
             </w:pPr>
             <w:r>
               <w:rPr>
                 <w:rFonts w:ascii="Calibri" w:hAnsi="Calibri"/>
                 <w:sz w:val="19"/>
               </w:rPr>
-              <w:t>Nhập hàng cơ bản &amp; Cất hàng (Inbound / Putaway)</w:t>
+              <w:t>Core Sổ cái Tồn kho (</w:t>
+            </w:r>
+            <w:r>
+              <w:rPr>
+                <w:rFonts w:ascii="Consolas" w:hAnsi="Consolas"/>
+                <w:color w:val="9C4124"/>
+                <w:sz w:val="18"/>
+              </w:rPr>
+              <w:t>InventoryLedgerService</w:t>
+            </w:r>
+            <w:r>
+              <w:rPr>
+                <w:rFonts w:ascii="Calibri" w:hAnsi="Calibri"/>
+                <w:sz w:val="19"/>
+              </w:rPr>
+              <w:t>) &amp; Tra cứu Tồn</w:t>
             </w:r>
           </w:p>
         </w:tc>
@@ -6273,7 +6706,7 @@
                 <w:rFonts w:ascii="Calibri" w:hAnsi="Calibri"/>
                 <w:sz w:val="19"/>
               </w:rPr>
-              <w:t>Nam Nguyen</w:t>
+              <w:t>Thuan Le</w:t>
             </w:r>
           </w:p>
         </w:tc>
@@ -6353,7 +6786,7 @@
                 <w:b/>
                 <w:sz w:val="19"/>
               </w:rPr>
-              <w:t>6</w:t>
+              <w:t>5</w:t>
             </w:r>
           </w:p>
         </w:tc>
@@ -6371,14 +6804,13 @@
           <w:p>
             <w:pPr>
               <w:spacing w:before="20" w:after="40" w:line="276" w:lineRule="auto"/>
-              <w:jc w:val="left"/>
             </w:pPr>
             <w:r>
               <w:rPr>
                 <w:rFonts w:ascii="Calibri" w:hAnsi="Calibri"/>
                 <w:sz w:val="19"/>
               </w:rPr>
-              <w:t>Quản lý Nhà cung cấp &amp; Đối tác (Suppliers)</w:t>
+              <w:t>Nhập hàng cơ bản &amp; Cất hàng (Inbound / Putaway)</w:t>
             </w:r>
           </w:p>
         </w:tc>
@@ -6428,7 +6860,7 @@
                 <w:rFonts w:ascii="Calibri" w:hAnsi="Calibri"/>
                 <w:sz w:val="19"/>
               </w:rPr>
-              <w:t>Trung Pham</w:t>
+              <w:t>Nam Nguyen</w:t>
             </w:r>
           </w:p>
         </w:tc>
@@ -6508,7 +6940,7 @@
                 <w:b/>
                 <w:sz w:val="19"/>
               </w:rPr>
-              <w:t>7</w:t>
+              <w:t>6</w:t>
             </w:r>
           </w:p>
         </w:tc>
@@ -6526,14 +6958,13 @@
           <w:p>
             <w:pPr>
               <w:spacing w:before="20" w:after="40" w:line="276" w:lineRule="auto"/>
-              <w:jc w:val="left"/>
             </w:pPr>
             <w:r>
               <w:rPr>
                 <w:rFonts w:ascii="Calibri" w:hAnsi="Calibri"/>
                 <w:sz w:val="19"/>
               </w:rPr>
-              <w:t>Kiểm kê (Cycle Count) &amp; Đề xuất điều chỉnh tồn kho</w:t>
+              <w:t>Quản lý Nhà cung cấp &amp; Đối tác (Suppliers)</w:t>
             </w:r>
           </w:p>
         </w:tc>
@@ -6583,7 +7014,7 @@
                 <w:rFonts w:ascii="Calibri" w:hAnsi="Calibri"/>
                 <w:sz w:val="19"/>
               </w:rPr>
-              <w:t>Thuan Le</w:t>
+              <w:t>Trung Pham</w:t>
             </w:r>
           </w:p>
         </w:tc>
@@ -6663,7 +7094,7 @@
                 <w:b/>
                 <w:sz w:val="19"/>
               </w:rPr>
-              <w:t>8</w:t>
+              <w:t>7</w:t>
             </w:r>
           </w:p>
         </w:tc>
@@ -6681,14 +7112,13 @@
           <w:p>
             <w:pPr>
               <w:spacing w:before="20" w:after="40" w:line="276" w:lineRule="auto"/>
-              <w:jc w:val="left"/>
             </w:pPr>
             <w:r>
               <w:rPr>
                 <w:rFonts w:ascii="Calibri" w:hAnsi="Calibri"/>
                 <w:sz w:val="19"/>
               </w:rPr>
-              <w:t>Mã QR Code cho Tem nhãn hàng hóa (SKU &amp; UOM)</w:t>
+              <w:t>Kiểm kê (Cycle Count) &amp; Đề xuất điều chỉnh tồn kho</w:t>
             </w:r>
           </w:p>
         </w:tc>
@@ -6818,7 +7248,7 @@
                 <w:b/>
                 <w:sz w:val="19"/>
               </w:rPr>
-              <w:t>9</w:t>
+              <w:t>8</w:t>
             </w:r>
           </w:p>
         </w:tc>
@@ -6836,14 +7266,13 @@
           <w:p>
             <w:pPr>
               <w:spacing w:before="20" w:after="40" w:line="276" w:lineRule="auto"/>
-              <w:jc w:val="left"/>
             </w:pPr>
             <w:r>
               <w:rPr>
                 <w:rFonts w:ascii="Calibri" w:hAnsi="Calibri"/>
                 <w:sz w:val="19"/>
               </w:rPr>
-              <w:t>Xuất kho (Shipment): Giữ chỗ FEFO &amp; Soạn hàng vào STAGING</w:t>
+              <w:t>Mã QR Code cho Tem nhãn hàng hóa (SKU &amp; UOM)</w:t>
             </w:r>
           </w:p>
         </w:tc>
@@ -6868,7 +7297,7 @@
                 <w:rFonts w:ascii="Calibri" w:hAnsi="Calibri"/>
                 <w:sz w:val="19"/>
               </w:rPr>
-              <w:t>Giai đoạn 2 → 3</w:t>
+              <w:t>Giai đoạn 2</w:t>
             </w:r>
           </w:p>
         </w:tc>
@@ -6893,7 +7322,7 @@
                 <w:rFonts w:ascii="Calibri" w:hAnsi="Calibri"/>
                 <w:sz w:val="19"/>
               </w:rPr>
-              <w:t>Nam Nguyen</w:t>
+              <w:t>Thuan Le</w:t>
             </w:r>
           </w:p>
         </w:tc>
@@ -6973,7 +7402,7 @@
                 <w:b/>
                 <w:sz w:val="19"/>
               </w:rPr>
-              <w:t>10</w:t>
+              <w:t>9</w:t>
             </w:r>
           </w:p>
         </w:tc>
@@ -6991,14 +7420,13 @@
           <w:p>
             <w:pPr>
               <w:spacing w:before="20" w:after="40" w:line="276" w:lineRule="auto"/>
-              <w:jc w:val="left"/>
             </w:pPr>
             <w:r>
               <w:rPr>
                 <w:rFonts w:ascii="Calibri" w:hAnsi="Calibri"/>
                 <w:sz w:val="19"/>
               </w:rPr>
-              <w:t>Chuyển kho nội bộ (Transfer) qua kho trung gian TRANSIT</w:t>
+              <w:t>Xuất kho (Shipment): Giữ chỗ FEFO &amp; Soạn hàng vào STAGING</w:t>
             </w:r>
           </w:p>
         </w:tc>
@@ -7048,7 +7476,7 @@
                 <w:rFonts w:ascii="Calibri" w:hAnsi="Calibri"/>
                 <w:sz w:val="19"/>
               </w:rPr>
-              <w:t>Thuan Le</w:t>
+              <w:t>Nam Nguyen</w:t>
             </w:r>
           </w:p>
         </w:tc>
@@ -7128,7 +7556,7 @@
                 <w:b/>
                 <w:sz w:val="19"/>
               </w:rPr>
-              <w:t>11</w:t>
+              <w:t>10</w:t>
             </w:r>
           </w:p>
         </w:tc>
@@ -7146,14 +7574,13 @@
           <w:p>
             <w:pPr>
               <w:spacing w:before="20" w:after="40" w:line="276" w:lineRule="auto"/>
-              <w:jc w:val="left"/>
             </w:pPr>
             <w:r>
               <w:rPr>
                 <w:rFonts w:ascii="Calibri" w:hAnsi="Calibri"/>
                 <w:sz w:val="19"/>
               </w:rPr>
-              <w:t>Bút toán đảo (Reversal) an toàn &amp; Điều chỉnh nhanh (Snapshot 409)</w:t>
+              <w:t>Chuyển kho nội bộ (Transfer) qua kho trung gian TRANSIT</w:t>
             </w:r>
           </w:p>
         </w:tc>
@@ -7203,7 +7630,7 @@
                 <w:rFonts w:ascii="Calibri" w:hAnsi="Calibri"/>
                 <w:sz w:val="19"/>
               </w:rPr>
-              <w:t>Trung Pham</w:t>
+              <w:t>Thuan Le</w:t>
             </w:r>
           </w:p>
         </w:tc>
@@ -7283,7 +7710,7 @@
                 <w:b/>
                 <w:sz w:val="19"/>
               </w:rPr>
-              <w:t>12</w:t>
+              <w:t>11</w:t>
             </w:r>
           </w:p>
         </w:tc>
@@ -7301,14 +7728,13 @@
           <w:p>
             <w:pPr>
               <w:spacing w:before="20" w:after="40" w:line="276" w:lineRule="auto"/>
-              <w:jc w:val="left"/>
             </w:pPr>
             <w:r>
               <w:rPr>
                 <w:rFonts w:ascii="Calibri" w:hAnsi="Calibri"/>
                 <w:sz w:val="19"/>
               </w:rPr>
-              <w:t>Xuất kho Dispatch trực tiếp cho Picker &amp; Xử lý Giao thiếu</w:t>
+              <w:t>Bút toán đảo (Reversal) an toàn &amp; Điều chỉnh nhanh (Snapshot 409)</w:t>
             </w:r>
           </w:p>
         </w:tc>
@@ -7333,7 +7759,7 @@
                 <w:rFonts w:ascii="Calibri" w:hAnsi="Calibri"/>
                 <w:sz w:val="19"/>
               </w:rPr>
-              <w:t>Giai đoạn 3</w:t>
+              <w:t>Giai đoạn 2 → 3</w:t>
             </w:r>
           </w:p>
         </w:tc>
@@ -7358,7 +7784,7 @@
                 <w:rFonts w:ascii="Calibri" w:hAnsi="Calibri"/>
                 <w:sz w:val="19"/>
               </w:rPr>
-              <w:t>Nam Nguyen</w:t>
+              <w:t>Trung Pham</w:t>
             </w:r>
           </w:p>
         </w:tc>
@@ -7438,7 +7864,7 @@
                 <w:b/>
                 <w:sz w:val="19"/>
               </w:rPr>
-              <w:t>13</w:t>
+              <w:t>12</w:t>
             </w:r>
           </w:p>
         </w:tc>
@@ -7456,29 +7882,13 @@
           <w:p>
             <w:pPr>
               <w:spacing w:before="20" w:after="40" w:line="276" w:lineRule="auto"/>
-              <w:jc w:val="left"/>
             </w:pPr>
             <w:r>
               <w:rPr>
                 <w:rFonts w:ascii="Calibri" w:hAnsi="Calibri"/>
                 <w:sz w:val="19"/>
               </w:rPr>
-              <w:t>Nhập kho Đa vị trí (</w:t>
-            </w:r>
-            <w:r>
-              <w:rPr>
-                <w:rFonts w:ascii="Consolas" w:hAnsi="Consolas"/>
-                <w:color w:val="9C4124"/>
-                <w:sz w:val="18"/>
-              </w:rPr>
-              <w:t>ReceiptLineDetail</w:t>
-            </w:r>
-            <w:r>
-              <w:rPr>
-                <w:rFonts w:ascii="Calibri" w:hAnsi="Calibri"/>
-                <w:sz w:val="19"/>
-              </w:rPr>
-              <w:t>: STORAGE, QC, DAMAGED)</w:t>
+              <w:t>Xuất kho Dispatch trực tiếp cho Picker &amp; Xử lý Giao thiếu</w:t>
             </w:r>
           </w:p>
         </w:tc>
@@ -7528,7 +7938,7 @@
                 <w:rFonts w:ascii="Calibri" w:hAnsi="Calibri"/>
                 <w:sz w:val="19"/>
               </w:rPr>
-              <w:t>Thuan Le</w:t>
+              <w:t>Nam Nguyen</w:t>
             </w:r>
           </w:p>
         </w:tc>
@@ -7608,7 +8018,7 @@
                 <w:b/>
                 <w:sz w:val="19"/>
               </w:rPr>
-              <w:t>14</w:t>
+              <w:t>13</w:t>
             </w:r>
           </w:p>
         </w:tc>
@@ -7626,14 +8036,28 @@
           <w:p>
             <w:pPr>
               <w:spacing w:before="20" w:after="40" w:line="276" w:lineRule="auto"/>
-              <w:jc w:val="left"/>
             </w:pPr>
             <w:r>
               <w:rPr>
                 <w:rFonts w:ascii="Calibri" w:hAnsi="Calibri"/>
                 <w:sz w:val="19"/>
               </w:rPr>
-              <w:t>Kiểm soát Sức chứa Phân cấp 5 tầng (Capacity Hierarchy)</w:t>
+              <w:t>Nhập kho Đa vị trí (</w:t>
+            </w:r>
+            <w:r>
+              <w:rPr>
+                <w:rFonts w:ascii="Consolas" w:hAnsi="Consolas"/>
+                <w:color w:val="9C4124"/>
+                <w:sz w:val="18"/>
+              </w:rPr>
+              <w:t>ReceiptLineDetail</w:t>
+            </w:r>
+            <w:r>
+              <w:rPr>
+                <w:rFonts w:ascii="Calibri" w:hAnsi="Calibri"/>
+                <w:sz w:val="19"/>
+              </w:rPr>
+              <w:t>: STORAGE, QC, DAMAGED)</w:t>
             </w:r>
           </w:p>
         </w:tc>
@@ -7763,7 +8187,7 @@
                 <w:b/>
                 <w:sz w:val="19"/>
               </w:rPr>
-              <w:t>15</w:t>
+              <w:t>14</w:t>
             </w:r>
           </w:p>
         </w:tc>
@@ -7781,14 +8205,13 @@
           <w:p>
             <w:pPr>
               <w:spacing w:before="20" w:after="40" w:line="276" w:lineRule="auto"/>
-              <w:jc w:val="left"/>
             </w:pPr>
             <w:r>
               <w:rPr>
                 <w:rFonts w:ascii="Calibri" w:hAnsi="Calibri"/>
                 <w:sz w:val="19"/>
               </w:rPr>
-              <w:t>Bảo vệ an toàn khi Xóa mềm Kho (Soft Delete Guard)</w:t>
+              <w:t>Kiểm soát Sức chứa Phân cấp 5 tầng (Capacity Hierarchy)</w:t>
             </w:r>
           </w:p>
         </w:tc>
@@ -7918,7 +8341,7 @@
                 <w:b/>
                 <w:sz w:val="19"/>
               </w:rPr>
-              <w:t>16</w:t>
+              <w:t>15</w:t>
             </w:r>
           </w:p>
         </w:tc>
@@ -7936,14 +8359,13 @@
           <w:p>
             <w:pPr>
               <w:spacing w:before="20" w:after="40" w:line="276" w:lineRule="auto"/>
-              <w:jc w:val="left"/>
             </w:pPr>
             <w:r>
               <w:rPr>
                 <w:rFonts w:ascii="Calibri" w:hAnsi="Calibri"/>
                 <w:sz w:val="19"/>
               </w:rPr>
-              <w:t>Module Hàng hoàn trả (Returns / RMA) &amp; Kiểm định KCS</w:t>
+              <w:t>Bảo vệ an toàn khi Xóa mềm Kho (Soft Delete Guard)</w:t>
             </w:r>
           </w:p>
         </w:tc>
@@ -7993,7 +8415,7 @@
                 <w:rFonts w:ascii="Calibri" w:hAnsi="Calibri"/>
                 <w:sz w:val="19"/>
               </w:rPr>
-              <w:t>Nam Nguyen</w:t>
+              <w:t>Thuan Le</w:t>
             </w:r>
           </w:p>
         </w:tc>
@@ -8073,7 +8495,7 @@
                 <w:b/>
                 <w:sz w:val="19"/>
               </w:rPr>
-              <w:t>17</w:t>
+              <w:t>16</w:t>
             </w:r>
           </w:p>
         </w:tc>
@@ -8091,14 +8513,13 @@
           <w:p>
             <w:pPr>
               <w:spacing w:before="20" w:after="40" w:line="276" w:lineRule="auto"/>
-              <w:jc w:val="left"/>
             </w:pPr>
             <w:r>
               <w:rPr>
                 <w:rFonts w:ascii="Calibri" w:hAnsi="Calibri"/>
                 <w:sz w:val="19"/>
               </w:rPr>
-              <w:t>Tự động sinh Mã vạch SKU-UOM tại Backend</w:t>
+              <w:t>Module Hàng hoàn trả (Returns / RMA) &amp; Kiểm định KCS</w:t>
             </w:r>
           </w:p>
         </w:tc>
@@ -8171,10 +8592,9 @@
             <w:r>
               <w:rPr>
                 <w:rFonts w:ascii="Calibri" w:hAnsi="Calibri"/>
-                <w:i/>
-                <w:sz w:val="19"/>
-              </w:rPr>
-              <w:t>(Auto API)</w:t>
+                <w:sz w:val="19"/>
+              </w:rPr>
+              <w:t>Vy Tran</w:t>
             </w:r>
           </w:p>
         </w:tc>
@@ -8229,7 +8649,7 @@
                 <w:b/>
                 <w:sz w:val="19"/>
               </w:rPr>
-              <w:t>18</w:t>
+              <w:t>17</w:t>
             </w:r>
           </w:p>
         </w:tc>
@@ -8247,14 +8667,13 @@
           <w:p>
             <w:pPr>
               <w:spacing w:before="20" w:after="40" w:line="276" w:lineRule="auto"/>
-              <w:jc w:val="left"/>
             </w:pPr>
             <w:r>
               <w:rPr>
                 <w:rFonts w:ascii="Calibri" w:hAnsi="Calibri"/>
                 <w:sz w:val="19"/>
               </w:rPr>
-              <w:t>Cảnh báo Cận date động &amp; Lọc Sơ đồ kho Active/Inactive/Tree</w:t>
+              <w:t>Tự động sinh Mã vạch SKU-UOM tại Backend</w:t>
             </w:r>
           </w:p>
         </w:tc>
@@ -8304,7 +8723,7 @@
                 <w:rFonts w:ascii="Calibri" w:hAnsi="Calibri"/>
                 <w:sz w:val="19"/>
               </w:rPr>
-              <w:t>Trung Pham</w:t>
+              <w:t>Nam Nguyen</w:t>
             </w:r>
           </w:p>
         </w:tc>
@@ -8327,9 +8746,10 @@
             <w:r>
               <w:rPr>
                 <w:rFonts w:ascii="Calibri" w:hAnsi="Calibri"/>
-                <w:sz w:val="19"/>
-              </w:rPr>
-              <w:t>Vy Tran</w:t>
+                <w:i/>
+                <w:sz w:val="19"/>
+              </w:rPr>
+              <w:t>(Auto API)</w:t>
             </w:r>
           </w:p>
         </w:tc>
@@ -8384,7 +8804,7 @@
                 <w:b/>
                 <w:sz w:val="19"/>
               </w:rPr>
-              <w:t>19</w:t>
+              <w:t>18</w:t>
             </w:r>
           </w:p>
         </w:tc>
@@ -8402,14 +8822,13 @@
           <w:p>
             <w:pPr>
               <w:spacing w:before="20" w:after="40" w:line="276" w:lineRule="auto"/>
-              <w:jc w:val="left"/>
             </w:pPr>
             <w:r>
               <w:rPr>
                 <w:rFonts w:ascii="Calibri" w:hAnsi="Calibri"/>
                 <w:sz w:val="19"/>
               </w:rPr>
-              <w:t>Reset Password cho Admin &amp; DB RBAC Patch</w:t>
+              <w:t>Cảnh báo Cận date động &amp; Lọc Sơ đồ kho Active/Inactive/Tree</w:t>
             </w:r>
           </w:p>
         </w:tc>
@@ -8539,7 +8958,7 @@
                 <w:b/>
                 <w:sz w:val="19"/>
               </w:rPr>
-              <w:t>20</w:t>
+              <w:t>19</w:t>
             </w:r>
           </w:p>
         </w:tc>
@@ -8557,14 +8976,13 @@
           <w:p>
             <w:pPr>
               <w:spacing w:before="20" w:after="40" w:line="276" w:lineRule="auto"/>
-              <w:jc w:val="left"/>
             </w:pPr>
             <w:r>
               <w:rPr>
                 <w:rFonts w:ascii="Calibri" w:hAnsi="Calibri"/>
                 <w:sz w:val="19"/>
               </w:rPr>
-              <w:t>Trang Tổng quan (Dashboard) đa phân vai theo 5 Role</w:t>
+              <w:t>Reset Password cho Admin &amp; DB RBAC Patch</w:t>
             </w:r>
           </w:p>
         </w:tc>
@@ -8647,6 +9065,160 @@
           <w:tcPr>
             <w:tcW w:type="dxa" w:w="1469"/>
             <w:shd w:fill="F7F9FB"/>
+            <w:tcMar>
+              <w:top w:w="90" w:type="dxa"/>
+              <w:bottom w:w="90" w:type="dxa"/>
+              <w:left w:w="110" w:type="dxa"/>
+              <w:right w:w="110" w:type="dxa"/>
+            </w:tcMar>
+          </w:tcPr>
+          <w:p>
+            <w:pPr>
+              <w:spacing w:before="20" w:after="40" w:line="276" w:lineRule="auto"/>
+              <w:jc w:val="center"/>
+            </w:pPr>
+            <w:r>
+              <w:rPr>
+                <w:rFonts w:ascii="Calibri" w:hAnsi="Calibri"/>
+                <w:sz w:val="19"/>
+              </w:rPr>
+              <w:t>Hoàn thành</w:t>
+            </w:r>
+          </w:p>
+        </w:tc>
+      </w:tr>
+      <w:tr>
+        <w:trPr>
+          <w:cantSplit/>
+        </w:trPr>
+        <w:tc>
+          <w:tcPr>
+            <w:tcW w:type="dxa" w:w="648"/>
+            <w:shd w:fill="FFFFFF"/>
+            <w:tcMar>
+              <w:top w:w="90" w:type="dxa"/>
+              <w:bottom w:w="90" w:type="dxa"/>
+              <w:left w:w="110" w:type="dxa"/>
+              <w:right w:w="110" w:type="dxa"/>
+            </w:tcMar>
+          </w:tcPr>
+          <w:p>
+            <w:pPr>
+              <w:spacing w:before="20" w:after="40" w:line="276" w:lineRule="auto"/>
+            </w:pPr>
+            <w:r>
+              <w:rPr>
+                <w:rFonts w:ascii="Calibri" w:hAnsi="Calibri"/>
+                <w:b/>
+                <w:sz w:val="19"/>
+              </w:rPr>
+              <w:t>20</w:t>
+            </w:r>
+          </w:p>
+        </w:tc>
+        <w:tc>
+          <w:tcPr>
+            <w:tcW w:type="dxa" w:w="3168"/>
+            <w:shd w:fill="FFFFFF"/>
+            <w:tcMar>
+              <w:top w:w="90" w:type="dxa"/>
+              <w:bottom w:w="90" w:type="dxa"/>
+              <w:left w:w="110" w:type="dxa"/>
+              <w:right w:w="110" w:type="dxa"/>
+            </w:tcMar>
+          </w:tcPr>
+          <w:p>
+            <w:pPr>
+              <w:spacing w:before="20" w:after="40" w:line="276" w:lineRule="auto"/>
+            </w:pPr>
+            <w:r>
+              <w:rPr>
+                <w:rFonts w:ascii="Calibri" w:hAnsi="Calibri"/>
+                <w:sz w:val="19"/>
+              </w:rPr>
+              <w:t>Trang Tổng quan (Dashboard) đa phân vai theo 5 Role</w:t>
+            </w:r>
+          </w:p>
+        </w:tc>
+        <w:tc>
+          <w:tcPr>
+            <w:tcW w:type="dxa" w:w="1296"/>
+            <w:shd w:fill="FFFFFF"/>
+            <w:tcMar>
+              <w:top w:w="90" w:type="dxa"/>
+              <w:bottom w:w="90" w:type="dxa"/>
+              <w:left w:w="110" w:type="dxa"/>
+              <w:right w:w="110" w:type="dxa"/>
+            </w:tcMar>
+          </w:tcPr>
+          <w:p>
+            <w:pPr>
+              <w:spacing w:before="20" w:after="40" w:line="276" w:lineRule="auto"/>
+              <w:jc w:val="center"/>
+            </w:pPr>
+            <w:r>
+              <w:rPr>
+                <w:rFonts w:ascii="Calibri" w:hAnsi="Calibri"/>
+                <w:sz w:val="19"/>
+              </w:rPr>
+              <w:t>Giai đoạn 3</w:t>
+            </w:r>
+          </w:p>
+        </w:tc>
+        <w:tc>
+          <w:tcPr>
+            <w:tcW w:type="dxa" w:w="1728"/>
+            <w:shd w:fill="FFFFFF"/>
+            <w:tcMar>
+              <w:top w:w="90" w:type="dxa"/>
+              <w:bottom w:w="90" w:type="dxa"/>
+              <w:left w:w="110" w:type="dxa"/>
+              <w:right w:w="110" w:type="dxa"/>
+            </w:tcMar>
+          </w:tcPr>
+          <w:p>
+            <w:pPr>
+              <w:spacing w:before="20" w:after="40" w:line="276" w:lineRule="auto"/>
+              <w:jc w:val="center"/>
+            </w:pPr>
+            <w:r>
+              <w:rPr>
+                <w:rFonts w:ascii="Calibri" w:hAnsi="Calibri"/>
+                <w:sz w:val="19"/>
+              </w:rPr>
+              <w:t>Trung Pham</w:t>
+            </w:r>
+          </w:p>
+        </w:tc>
+        <w:tc>
+          <w:tcPr>
+            <w:tcW w:type="dxa" w:w="1296"/>
+            <w:shd w:fill="FFFFFF"/>
+            <w:tcMar>
+              <w:top w:w="90" w:type="dxa"/>
+              <w:bottom w:w="90" w:type="dxa"/>
+              <w:left w:w="110" w:type="dxa"/>
+              <w:right w:w="110" w:type="dxa"/>
+            </w:tcMar>
+          </w:tcPr>
+          <w:p>
+            <w:pPr>
+              <w:spacing w:before="20" w:after="40" w:line="276" w:lineRule="auto"/>
+              <w:jc w:val="center"/>
+            </w:pPr>
+            <w:r>
+              <w:rPr>
+                <w:rFonts w:ascii="Calibri" w:hAnsi="Calibri"/>
+                <w:sz w:val="19"/>
+              </w:rPr>
+              <w:t>Vy Tran</w:t>
+            </w:r>
+          </w:p>
+        </w:tc>
+        <w:tc>
+          <w:tcPr>
+            <w:tcW w:type="dxa" w:w="1469"/>
+            <w:shd w:fill="FFFFFF"/>
             <w:tcMar>
               <w:top w:w="90" w:type="dxa"/>
               <w:bottom w:w="90" w:type="dxa"/>

</xml_diff>